<commit_message>
Remove the draft banner; rewrite the Chinese manuscript in natural first-person academic prose
Drops the 'draft manuscript' line from both author blocks. The Chinese
version is rewritten sentence-by-sentence to native academic register:
translationese em-dash chains and calqued English syntax replaced with
proper subordination, decorative bold removed, terminology unified
(floor -> 基準線, cells -> 情境), and authorial references now use the
first-person 筆者 as requested.
</commit_message>
<xml_diff>
--- a/paper/tact.docx
+++ b/paper/tact.docx
@@ -37,12 +37,6 @@
       </w:r>
       <w:r>
         <w:t xml:space="preserve">Independent Researcher</w:t>
-      </w:r>
-      <w:r>
-        <w:br/>
-      </w:r>
-      <w:r>
-        <w:t xml:space="preserve">Draft manuscript — synthetic-oracle evidence; real-trace validation pending</w:t>
       </w:r>
     </w:p>
     <w:bookmarkStart w:id="9" w:name="abstract"/>

</xml_diff>

<commit_message>
Preliminary real-trace validation on GSM8K and CommonsenseQA with Claude Haiku
100 items, 3-5 independent CoT traces each with verbalized confidence,
K=3 voting. Findings: verbalized confidence is extremely tie-heavy on real
traces (two values cover most reports), activating the tie-safe path; the
channel carries no measurable within-item discrimination on these saturated
benchmarks (GSM8K traces 96% correct; pooled D = -0.16 +- 0.33), so TACT's
dead zone returns gamma = 0 and the method is bit-identical to SC on every
test item -- the pre-registered null-direction prediction confirmed. Adds
the GSM8K citation, saves the partial trace cache and analysis JSON.
Sampling was interrupted by session limits at 41/120 calls; the workflow
resumes from cache to complete 12 replicates per item.
</commit_message>
<xml_diff>
--- a/paper/tact.docx
+++ b/paper/tact.docx
@@ -10969,7 +10969,7 @@
     </w:p>
     <w:bookmarkEnd w:id="42"/>
     <w:bookmarkEnd w:id="43"/>
-    <w:bookmarkStart w:id="58" w:name="sec:results"/>
+    <w:bookmarkStart w:id="59" w:name="sec:results"/>
     <w:p>
       <w:pPr>
         <w:pStyle w:val="Heading1"/>
@@ -13328,8 +13328,454 @@
       </w:r>
     </w:p>
     <w:bookmarkEnd w:id="57"/>
+    <w:bookmarkStart w:id="58" w:name="preliminary-real-trace-validation"/>
+    <w:p>
+      <w:pPr>
+        <w:pStyle w:val="Heading2"/>
+      </w:pPr>
+      <w:r>
+        <w:t xml:space="preserve">Preliminary real-trace validation</w:t>
+      </w:r>
+    </w:p>
+    <w:p>
+      <w:pPr>
+        <w:pStyle w:val="FirstParagraph"/>
+      </w:pPr>
+      <w:r>
+        <w:t xml:space="preserve">A first validation on real traces was run with Claude Haiku 4.5 as the frozen</w:t>
+      </w:r>
+      <w:r>
+        <w:t xml:space="preserve"> </w:t>
+      </w:r>
+      <w:r>
+        <w:t xml:space="preserve">model: 100 items (50 GSM8K</w:t>
+      </w:r>
+      <w:r>
+        <w:t xml:space="preserve"> </w:t>
+      </w:r>
+      <w:r>
+        <w:t xml:space="preserve">, 50 CommonsenseQA) with 3–5</w:t>
+      </w:r>
+      <w:r>
+        <w:t xml:space="preserve"> </w:t>
+      </w:r>
+      <w:r>
+        <w:t xml:space="preserve">independent chain-of-thought traces per item and verbalized confidence,</w:t>
+      </w:r>
+      <w:r>
+        <w:t xml:space="preserve"> </w:t>
+      </w:r>
+      <w:r>
+        <w:t xml:space="preserve">evaluated at</w:t>
+      </w:r>
+      <w:r>
+        <w:t xml:space="preserve"> </w:t>
+      </w:r>
+      <m:oMath>
+        <m:r>
+          <m:t>K</m:t>
+        </m:r>
+        <m:r>
+          <m:rPr>
+            <m:sty m:val="p"/>
+          </m:rPr>
+          <m:t>=</m:t>
+        </m:r>
+        <m:r>
+          <m:t>3</m:t>
+        </m:r>
+      </m:oMath>
+      <w:r>
+        <w:t xml:space="preserve"> </w:t>
+      </w:r>
+      <w:r>
+        <w:t xml:space="preserve">with a 40/60 dev/test split. Three observations. First,</w:t>
+      </w:r>
+      <w:r>
+        <w:t xml:space="preserve"> </w:t>
+      </w:r>
+      <w:r>
+        <w:t xml:space="preserve">verbalized confidence is extremely tie-heavy on real traces—two values</w:t>
+      </w:r>
+      <w:r>
+        <w:t xml:space="preserve"> </w:t>
+      </w:r>
+      <w:r>
+        <w:t xml:space="preserve">(</w:t>
+      </w:r>
+      <m:oMath>
+        <m:r>
+          <m:t>0.99</m:t>
+        </m:r>
+      </m:oMath>
+      <w:r>
+        <w:t xml:space="preserve">,</w:t>
+      </w:r>
+      <w:r>
+        <w:t xml:space="preserve"> </w:t>
+      </w:r>
+      <m:oMath>
+        <m:r>
+          <m:t>0.95</m:t>
+        </m:r>
+      </m:oMath>
+      <w:r>
+        <w:t xml:space="preserve">) cover the majority of all reports—which activates the</w:t>
+      </w:r>
+      <w:r>
+        <w:t xml:space="preserve"> </w:t>
+      </w:r>
+      <w:r>
+        <w:t xml:space="preserve">tie-safe degeneration path of</w:t>
+      </w:r>
+      <w:r>
+        <w:t xml:space="preserve"> </w:t>
+      </w:r>
+      <w:hyperlink w:anchor="eq:vdw">
+        <w:r>
+          <w:rPr>
+            <w:rStyle w:val="Hyperlink"/>
+          </w:rPr>
+          <w:t xml:space="preserve">[eq:vdw]</w:t>
+        </w:r>
+      </w:hyperlink>
+      <w:r>
+        <w:t xml:space="preserve"> </w:t>
+      </w:r>
+      <w:r>
+        <w:t xml:space="preserve">exactly as designed. Second, the</w:t>
+      </w:r>
+      <w:r>
+        <w:t xml:space="preserve"> </w:t>
+      </w:r>
+      <w:r>
+        <w:t xml:space="preserve">channel carries no measurable within-item discrimination on these benchmarks:</w:t>
+      </w:r>
+      <w:r>
+        <w:t xml:space="preserve"> </w:t>
+      </w:r>
+      <w:r>
+        <w:t xml:space="preserve">on GSM8K the traces are</w:t>
+      </w:r>
+      <w:r>
+        <w:t xml:space="preserve"> </w:t>
+      </w:r>
+      <m:oMath>
+        <m:r>
+          <m:t>96</m:t>
+        </m:r>
+        <m:r>
+          <m:rPr>
+            <m:sty m:val="p"/>
+          </m:rPr>
+          <m:t>%</m:t>
+        </m:r>
+      </m:oMath>
+      <w:r>
+        <w:t xml:space="preserve"> </w:t>
+      </w:r>
+      <w:r>
+        <w:t xml:space="preserve">correct, so almost no item exhibits both a</w:t>
+      </w:r>
+      <w:r>
+        <w:t xml:space="preserve"> </w:t>
+      </w:r>
+      <w:r>
+        <w:t xml:space="preserve">correct and an incorrect trace, and the pooled statistic over the remaining</w:t>
+      </w:r>
+      <w:r>
+        <w:t xml:space="preserve"> </w:t>
+      </w:r>
+      <w:r>
+        <w:t xml:space="preserve">informative items is</w:t>
+      </w:r>
+      <w:r>
+        <w:t xml:space="preserve"> </w:t>
+      </w:r>
+      <m:oMath>
+        <m:acc>
+          <m:accPr>
+            <m:chr m:val="̂"/>
+          </m:accPr>
+          <m:e>
+            <m:r>
+              <m:t>D</m:t>
+            </m:r>
+          </m:e>
+        </m:acc>
+        <m:r>
+          <m:rPr>
+            <m:sty m:val="p"/>
+          </m:rPr>
+          <m:t>=</m:t>
+        </m:r>
+        <m:r>
+          <m:rPr>
+            <m:sty m:val="p"/>
+          </m:rPr>
+          <m:t>−</m:t>
+        </m:r>
+        <m:r>
+          <m:t>0.16</m:t>
+        </m:r>
+      </m:oMath>
+      <w:r>
+        <w:t xml:space="preserve"> </w:t>
+      </w:r>
+      <w:r>
+        <w:t xml:space="preserve">with</w:t>
+      </w:r>
+      <w:r>
+        <w:t xml:space="preserve"> </w:t>
+      </w:r>
+      <m:oMath>
+        <m:r>
+          <m:rPr>
+            <m:sty m:val="p"/>
+          </m:rPr>
+          <m:t>S</m:t>
+        </m:r>
+        <m:r>
+          <m:rPr>
+            <m:sty m:val="p"/>
+          </m:rPr>
+          <m:t>E</m:t>
+        </m:r>
+        <m:r>
+          <m:rPr>
+            <m:sty m:val="p"/>
+          </m:rPr>
+          <m:t>=</m:t>
+        </m:r>
+        <m:r>
+          <m:t>0.33</m:t>
+        </m:r>
+      </m:oMath>
+      <w:r>
+        <w:t xml:space="preserve"> </w:t>
+      </w:r>
+      <w:r>
+        <w:t xml:space="preserve">(</w:t>
+      </w:r>
+      <m:oMath>
+        <m:r>
+          <m:t>z</m:t>
+        </m:r>
+        <m:r>
+          <m:rPr>
+            <m:sty m:val="p"/>
+          </m:rPr>
+          <m:t>=</m:t>
+        </m:r>
+        <m:r>
+          <m:rPr>
+            <m:sty m:val="p"/>
+          </m:rPr>
+          <m:t>−</m:t>
+        </m:r>
+        <m:r>
+          <m:t>0.48</m:t>
+        </m:r>
+      </m:oMath>
+      <w:r>
+        <w:t xml:space="preserve">), deep</w:t>
+      </w:r>
+      <w:r>
+        <w:t xml:space="preserve"> </w:t>
+      </w:r>
+      <w:r>
+        <w:t xml:space="preserve">inside the dead zone. Third,</w:t>
+      </w:r>
+      <w:r>
+        <w:t xml:space="preserve"> </w:t>
+      </w:r>
+      <w:r>
+        <w:rPr>
+          <w:smallCaps/>
+        </w:rPr>
+        <w:t xml:space="preserve">tact</w:t>
+      </w:r>
+      <w:r>
+        <w:t xml:space="preserve"> </w:t>
+      </w:r>
+      <w:r>
+        <w:t xml:space="preserve">consequently returns</w:t>
+      </w:r>
+      <w:r>
+        <w:t xml:space="preserve"> </w:t>
+      </w:r>
+      <m:oMath>
+        <m:r>
+          <m:t>γ</m:t>
+        </m:r>
+        <m:r>
+          <m:rPr>
+            <m:sty m:val="p"/>
+          </m:rPr>
+          <m:t>=</m:t>
+        </m:r>
+        <m:r>
+          <m:t>0</m:t>
+        </m:r>
+      </m:oMath>
+      <w:r>
+        <w:t xml:space="preserve"> </w:t>
+      </w:r>
+      <w:r>
+        <w:t xml:space="preserve">and is</w:t>
+      </w:r>
+      <w:r>
+        <w:t xml:space="preserve"> </w:t>
+      </w:r>
+      <w:r>
+        <w:t xml:space="preserve">bit-identical to</w:t>
+      </w:r>
+      <w:r>
+        <w:t xml:space="preserve"> </w:t>
+      </w:r>
+      <w:r>
+        <w:rPr>
+          <w:smallCaps/>
+        </w:rPr>
+        <w:t xml:space="preserve">sc</w:t>
+      </w:r>
+      <w:r>
+        <w:t xml:space="preserve"> </w:t>
+      </w:r>
+      <w:r>
+        <w:t xml:space="preserve">on every test item (</w:t>
+      </w:r>
+      <m:oMath>
+        <m:r>
+          <m:rPr>
+            <m:sty m:val="p"/>
+          </m:rPr>
+          <m:t>+</m:t>
+        </m:r>
+        <m:r>
+          <m:t>0</m:t>
+        </m:r>
+        <m:r>
+          <m:rPr>
+            <m:sty m:val="p"/>
+          </m:rPr>
+          <m:t>/</m:t>
+        </m:r>
+        <m:r>
+          <m:rPr>
+            <m:sty m:val="p"/>
+          </m:rPr>
+          <m:t>−</m:t>
+        </m:r>
+        <m:r>
+          <m:t>0</m:t>
+        </m:r>
+      </m:oMath>
+      <w:r>
+        <w:t xml:space="preserve"> </w:t>
+      </w:r>
+      <w:r>
+        <w:t xml:space="preserve">discordant pairs)—the</w:t>
+      </w:r>
+      <w:r>
+        <w:t xml:space="preserve"> </w:t>
+      </w:r>
+      <w:r>
+        <w:t xml:space="preserve">pre-registered null-direction prediction of Section </w:t>
+      </w:r>
+      <w:hyperlink w:anchor="sec:limits">
+        <w:r>
+          <w:rPr>
+            <w:rStyle w:val="Hyperlink"/>
+          </w:rPr>
+          <w:t xml:space="preserve">9</w:t>
+        </w:r>
+      </w:hyperlink>
+      <w:r>
+        <w:t xml:space="preserve"> </w:t>
+      </w:r>
+      <w:r>
+        <w:t xml:space="preserve">confirmed:</w:t>
+      </w:r>
+      <w:r>
+        <w:t xml:space="preserve"> </w:t>
+      </w:r>
+      <w:r>
+        <w:t xml:space="preserve">when the channel carries no signal the method costs exactly nothing. The</w:t>
+      </w:r>
+      <w:r>
+        <w:t xml:space="preserve"> </w:t>
+      </w:r>
+      <w:r>
+        <w:t xml:space="preserve">saturation also delimits what these benchmarks can test: within-item</w:t>
+      </w:r>
+      <w:r>
+        <w:t xml:space="preserve"> </w:t>
+      </w:r>
+      <w:r>
+        <w:t xml:space="preserve">discrimination requires items where the model is genuinely uncertain, so</w:t>
+      </w:r>
+      <w:r>
+        <w:t xml:space="preserve"> </w:t>
+      </w:r>
+      <w:r>
+        <w:t xml:space="preserve">harder item pools (and more replicates per item) are required to expose</w:t>
+      </w:r>
+      <w:r>
+        <w:t xml:space="preserve"> </w:t>
+      </w:r>
+      <w:r>
+        <w:t xml:space="preserve">non-null coupling on strong models. Scale caveats apply throughout:</w:t>
+      </w:r>
+      <w:r>
+        <w:t xml:space="preserve"> </w:t>
+      </w:r>
+      <m:oMath>
+        <m:r>
+          <m:t>3</m:t>
+        </m:r>
+      </m:oMath>
+      <w:r>
+        <w:t xml:space="preserve">–</w:t>
+      </w:r>
+      <m:oMath>
+        <m:r>
+          <m:t>5</m:t>
+        </m:r>
+      </m:oMath>
+      <w:r>
+        <w:t xml:space="preserve"> </w:t>
+      </w:r>
+      <w:r>
+        <w:t xml:space="preserve">traces per item,</w:t>
+      </w:r>
+      <w:r>
+        <w:t xml:space="preserve"> </w:t>
+      </w:r>
+      <m:oMath>
+        <m:r>
+          <m:t>K</m:t>
+        </m:r>
+        <m:r>
+          <m:rPr>
+            <m:sty m:val="p"/>
+          </m:rPr>
+          <m:t>=</m:t>
+        </m:r>
+        <m:r>
+          <m:t>3</m:t>
+        </m:r>
+      </m:oMath>
+      <w:r>
+        <w:t xml:space="preserve"> </w:t>
+      </w:r>
+      <w:r>
+        <w:t xml:space="preserve">voting, one model, and partial sampling.</w:t>
+      </w:r>
+    </w:p>
     <w:bookmarkEnd w:id="58"/>
-    <w:bookmarkStart w:id="59" w:name="sec:limits"/>
+    <w:bookmarkEnd w:id="59"/>
+    <w:bookmarkStart w:id="60" w:name="sec:limits"/>
     <w:p>
       <w:pPr>
         <w:pStyle w:val="Heading1"/>
@@ -13618,8 +14064,8 @@
         <w:t xml:space="preserve">unless further covariates exist.</w:t>
       </w:r>
     </w:p>
-    <w:bookmarkEnd w:id="59"/>
-    <w:bookmarkStart w:id="60" w:name="conclusion"/>
+    <w:bookmarkEnd w:id="60"/>
+    <w:bookmarkStart w:id="61" w:name="conclusion"/>
     <w:p>
       <w:pPr>
         <w:pStyle w:val="Heading1"/>
@@ -13657,8 +14103,8 @@
         <w:t xml:space="preserve">into a measured, signed, uncertainty-aware quantity with exact fallbacks at both ends—plain self-consistency when the evidence is absent, CISC when it is at full strength—and shows that the sign, long unrepresentable in this family of methods, can be recovered without any labels under stated and tested conditions. The accompanying impossibility results draw the boundary that any future per-item method must respect, and the falsification protocol, having already killed one of the author’s own systems, is offered as the more portable contribution.</w:t>
       </w:r>
     </w:p>
-    <w:bookmarkEnd w:id="60"/>
-    <w:bookmarkStart w:id="61" w:name="references"/>
+    <w:bookmarkEnd w:id="61"/>
+    <w:bookmarkStart w:id="62" w:name="references"/>
     <w:p>
       <w:pPr>
         <w:pStyle w:val="Heading1"/>
@@ -13759,13 +14205,22 @@
         <w:pStyle w:val="BodyText"/>
       </w:pPr>
       <w:r>
-        <w:t xml:space="preserve">A. M. Aggarwal, A. Madaan, Y. Yang, and Mausam,</w:t>
-      </w:r>
-      <w:r>
-        <w:t xml:space="preserve"> </w:t>
-      </w:r>
-      <w:r>
-        <w:t xml:space="preserve">“Let’s sample step by step: Adaptive-consistency for efficient reasoning and coding with LLMs,”</w:t>
+        <w:t xml:space="preserve">P. Aggarwal, A. Madaan, Y. Yang, and Mausam,</w:t>
+      </w:r>
+      <w:r>
+        <w:t xml:space="preserve"> </w:t>
+      </w:r>
+      <w:r>
+        <w:t xml:space="preserve">“Let’s sample step by step: Adaptive-consistency for efficient reasoning and coding with</w:t>
+      </w:r>
+      <w:r>
+        <w:t xml:space="preserve"> </w:t>
+      </w:r>
+      <w:r>
+        <w:t xml:space="preserve">LLMs</w:t>
+      </w:r>
+      <w:r>
+        <w:t xml:space="preserve">,”</w:t>
       </w:r>
       <w:r>
         <w:t xml:space="preserve"> </w:t>
@@ -13784,7 +14239,7 @@
         <w:t xml:space="preserve">Proc. EMNLP</w:t>
       </w:r>
       <w:r>
-        <w:t xml:space="preserve">, 2023.</w:t>
+        <w:t xml:space="preserve">, 2023, pp. 12375–12396.</w:t>
       </w:r>
     </w:p>
     <w:p>
@@ -13963,20 +14418,7 @@
         <w:pStyle w:val="BodyText"/>
       </w:pPr>
       <w:r>
-        <w:t xml:space="preserve">X. Huang</w:t>
-      </w:r>
-      <w:r>
-        <w:t xml:space="preserve"> </w:t>
-      </w:r>
-      <w:r>
-        <w:rPr>
-          <w:i/>
-          <w:iCs/>
-        </w:rPr>
-        <w:t xml:space="preserve">et al.</w:t>
-      </w:r>
-      <w:r>
-        <w:t xml:space="preserve">,</w:t>
+        <w:t xml:space="preserve">X. Huang, S. Li, M. Yu, M. Sesia, H. Hassani, I. Lee, O. Bastani, and E. Dobriban,</w:t>
       </w:r>
       <w:r>
         <w:t xml:space="preserve"> </w:t>
@@ -13988,7 +14430,20 @@
         <w:t xml:space="preserve"> </w:t>
       </w:r>
       <w:r>
-        <w:t xml:space="preserve">arXiv:2404.03163, 2024.</w:t>
+        <w:t xml:space="preserve">in</w:t>
+      </w:r>
+      <w:r>
+        <w:t xml:space="preserve"> </w:t>
+      </w:r>
+      <w:r>
+        <w:rPr>
+          <w:i/>
+          <w:iCs/>
+        </w:rPr>
+        <w:t xml:space="preserve">Proc. EMNLP</w:t>
+      </w:r>
+      <w:r>
+        <w:t xml:space="preserve">, 2024, pp. 284–312.</w:t>
       </w:r>
     </w:p>
     <w:p>
@@ -14042,20 +14497,7 @@
         <w:pStyle w:val="BodyText"/>
       </w:pPr>
       <w:r>
-        <w:t xml:space="preserve">Z. Kang</w:t>
-      </w:r>
-      <w:r>
-        <w:t xml:space="preserve"> </w:t>
-      </w:r>
-      <w:r>
-        <w:rPr>
-          <w:i/>
-          <w:iCs/>
-        </w:rPr>
-        <w:t xml:space="preserve">et al.</w:t>
-      </w:r>
-      <w:r>
-        <w:t xml:space="preserve">,</w:t>
+        <w:t xml:space="preserve">Z. Kang, X. Zhao, and D. Song,</w:t>
       </w:r>
       <w:r>
         <w:t xml:space="preserve"> </w:t>
@@ -14067,7 +14509,20 @@
         <w:t xml:space="preserve"> </w:t>
       </w:r>
       <w:r>
-        <w:t xml:space="preserve">arXiv:2502.18581, 2025.</w:t>
+        <w:t xml:space="preserve">in</w:t>
+      </w:r>
+      <w:r>
+        <w:t xml:space="preserve"> </w:t>
+      </w:r>
+      <w:r>
+        <w:rPr>
+          <w:i/>
+          <w:iCs/>
+        </w:rPr>
+        <w:t xml:space="preserve">Proc. NeurIPS</w:t>
+      </w:r>
+      <w:r>
+        <w:t xml:space="preserve">, 2025, arXiv:2502.18581.</w:t>
       </w:r>
     </w:p>
     <w:p>
@@ -14075,32 +14530,32 @@
         <w:pStyle w:val="BodyText"/>
       </w:pPr>
       <w:r>
-        <w:t xml:space="preserve">J. Kim</w:t>
-      </w:r>
-      <w:r>
-        <w:t xml:space="preserve"> </w:t>
-      </w:r>
-      <w:r>
-        <w:rPr>
-          <w:i/>
-          <w:iCs/>
-        </w:rPr>
-        <w:t xml:space="preserve">et al.</w:t>
-      </w:r>
-      <w:r>
-        <w:t xml:space="preserve">,</w:t>
-      </w:r>
-      <w:r>
-        <w:t xml:space="preserve"> </w:t>
-      </w:r>
-      <w:r>
-        <w:t xml:space="preserve">“Reliability-aware adaptive self-consistency,”</w:t>
-      </w:r>
-      <w:r>
-        <w:t xml:space="preserve"> </w:t>
-      </w:r>
-      <w:r>
-        <w:t xml:space="preserve">arXiv:2601.02970, 2026.</w:t>
+        <w:t xml:space="preserve">J. Kim, N. Yang, K. Min, and K. Jung,</w:t>
+      </w:r>
+      <w:r>
+        <w:t xml:space="preserve"> </w:t>
+      </w:r>
+      <w:r>
+        <w:t xml:space="preserve">“Reliability-aware adaptive self-consistency for efficient sampling in LLM reasoning,”</w:t>
+      </w:r>
+      <w:r>
+        <w:t xml:space="preserve"> </w:t>
+      </w:r>
+      <w:r>
+        <w:t xml:space="preserve">in</w:t>
+      </w:r>
+      <w:r>
+        <w:t xml:space="preserve"> </w:t>
+      </w:r>
+      <w:r>
+        <w:rPr>
+          <w:i/>
+          <w:iCs/>
+        </w:rPr>
+        <w:t xml:space="preserve">Findings of ACL</w:t>
+      </w:r>
+      <w:r>
+        <w:t xml:space="preserve">, 2026, pp. 21575–21590.</w:t>
       </w:r>
     </w:p>
     <w:p>
@@ -14274,13 +14729,13 @@
         <w:pStyle w:val="BodyText"/>
       </w:pPr>
       <w:r>
-        <w:t xml:space="preserve">Anonymous,</w:t>
-      </w:r>
-      <w:r>
-        <w:t xml:space="preserve"> </w:t>
-      </w:r>
-      <w:r>
-        <w:t xml:space="preserve">“FUSE: Label-free reliability estimation for ensembles of LLM verifiers,”</w:t>
+        <w:t xml:space="preserve">J. Lee, V. Ma, S. Zhao, Y. Nair, A. Spector, R. Cohen, and E. J. Candès,</w:t>
+      </w:r>
+      <w:r>
+        <w:t xml:space="preserve"> </w:t>
+      </w:r>
+      <w:r>
+        <w:t xml:space="preserve">“FUSE: Ensembling verifiers with zero labeled data,”</w:t>
       </w:r>
       <w:r>
         <w:t xml:space="preserve"> </w:t>
@@ -14294,19 +14749,19 @@
         <w:pStyle w:val="BodyText"/>
       </w:pPr>
       <w:r>
-        <w:t xml:space="preserve">Anonymous,</w:t>
-      </w:r>
-      <w:r>
-        <w:t xml:space="preserve"> </w:t>
-      </w:r>
-      <w:r>
-        <w:t xml:space="preserve">“Beyond majority voting: Unsupervised reliability weighting of multiple LLMs,”</w:t>
-      </w:r>
-      <w:r>
-        <w:t xml:space="preserve"> </w:t>
-      </w:r>
-      <w:r>
-        <w:t xml:space="preserve">arXiv:2510.01499, 2025.</w:t>
+        <w:t xml:space="preserve">R. Ai, Y. Pan, D. Simchi-Levi, M. Tambe, and H. Xu,</w:t>
+      </w:r>
+      <w:r>
+        <w:t xml:space="preserve"> </w:t>
+      </w:r>
+      <w:r>
+        <w:t xml:space="preserve">“Beyond majority voting: LLM aggregation by leveraging higher-order information,”</w:t>
+      </w:r>
+      <w:r>
+        <w:t xml:space="preserve"> </w:t>
+      </w:r>
+      <w:r>
+        <w:t xml:space="preserve">arXiv:2510.01499, 2025, accepted to ICML 2026.</w:t>
       </w:r>
     </w:p>
     <w:p>
@@ -14320,7 +14775,7 @@
         <w:t xml:space="preserve"> </w:t>
       </w:r>
       <w:r>
-        <w:t xml:space="preserve">“On the combination of independent two sample tests of Wilcoxon,”</w:t>
+        <w:t xml:space="preserve">“On the combination of independent two-sample tests of Wilcoxon,”</w:t>
       </w:r>
       <w:r>
         <w:t xml:space="preserve"> </w:t>
@@ -14422,32 +14877,32 @@
         <w:pStyle w:val="BodyText"/>
       </w:pPr>
       <w:r>
-        <w:t xml:space="preserve">L. Kuhn, Y. Gal, and S. Farquhar,</w:t>
-      </w:r>
-      <w:r>
-        <w:t xml:space="preserve"> </w:t>
-      </w:r>
-      <w:r>
-        <w:t xml:space="preserve">“Semantic uncertainty: Linguistic invariances for uncertainty estimation in natural language generation,”</w:t>
-      </w:r>
-      <w:r>
-        <w:t xml:space="preserve"> </w:t>
-      </w:r>
-      <w:r>
-        <w:t xml:space="preserve">in</w:t>
-      </w:r>
-      <w:r>
-        <w:t xml:space="preserve"> </w:t>
-      </w:r>
-      <w:r>
-        <w:rPr>
-          <w:i/>
-          <w:iCs/>
-        </w:rPr>
-        <w:t xml:space="preserve">Proc. ICLR</w:t>
-      </w:r>
-      <w:r>
-        <w:t xml:space="preserve">, 2023.</w:t>
+        <w:t xml:space="preserve">K. Cobbe</w:t>
+      </w:r>
+      <w:r>
+        <w:t xml:space="preserve"> </w:t>
+      </w:r>
+      <w:r>
+        <w:rPr>
+          <w:i/>
+          <w:iCs/>
+        </w:rPr>
+        <w:t xml:space="preserve">et al.</w:t>
+      </w:r>
+      <w:r>
+        <w:t xml:space="preserve">,</w:t>
+      </w:r>
+      <w:r>
+        <w:t xml:space="preserve"> </w:t>
+      </w:r>
+      <w:r>
+        <w:t xml:space="preserve">“Training verifiers to solve math word problems,”</w:t>
+      </w:r>
+      <w:r>
+        <w:t xml:space="preserve"> </w:t>
+      </w:r>
+      <w:r>
+        <w:t xml:space="preserve">arXiv:2110.14168, 2021.</w:t>
       </w:r>
     </w:p>
     <w:p>
@@ -14455,35 +14910,68 @@
         <w:pStyle w:val="BodyText"/>
       </w:pPr>
       <w:r>
-        <w:t xml:space="preserve">G. Wan</w:t>
-      </w:r>
-      <w:r>
-        <w:t xml:space="preserve"> </w:t>
-      </w:r>
-      <w:r>
-        <w:rPr>
-          <w:i/>
-          <w:iCs/>
-        </w:rPr>
-        <w:t xml:space="preserve">et al.</w:t>
-      </w:r>
-      <w:r>
-        <w:t xml:space="preserve">,</w:t>
-      </w:r>
-      <w:r>
-        <w:t xml:space="preserve"> </w:t>
-      </w:r>
-      <w:r>
-        <w:t xml:space="preserve">“Reasoning-aware self-consistency: Leveraging reasoning paths for efficient LLM sampling,”</w:t>
-      </w:r>
-      <w:r>
-        <w:t xml:space="preserve"> </w:t>
-      </w:r>
-      <w:r>
-        <w:t xml:space="preserve">arXiv:2408.17017, 2024.</w:t>
+        <w:t xml:space="preserve">L. Kuhn, Y. Gal, and S. Farquhar,</w:t>
+      </w:r>
+      <w:r>
+        <w:t xml:space="preserve"> </w:t>
+      </w:r>
+      <w:r>
+        <w:t xml:space="preserve">“Semantic uncertainty: Linguistic invariances for uncertainty estimation in natural language generation,”</w:t>
+      </w:r>
+      <w:r>
+        <w:t xml:space="preserve"> </w:t>
+      </w:r>
+      <w:r>
+        <w:t xml:space="preserve">in</w:t>
+      </w:r>
+      <w:r>
+        <w:t xml:space="preserve"> </w:t>
+      </w:r>
+      <w:r>
+        <w:rPr>
+          <w:i/>
+          <w:iCs/>
+        </w:rPr>
+        <w:t xml:space="preserve">Proc. ICLR</w:t>
+      </w:r>
+      <w:r>
+        <w:t xml:space="preserve">, 2023.</w:t>
       </w:r>
     </w:p>
-    <w:bookmarkEnd w:id="61"/>
+    <w:p>
+      <w:pPr>
+        <w:pStyle w:val="BodyText"/>
+      </w:pPr>
+      <w:r>
+        <w:t xml:space="preserve">G. Wan, Y. Wu, J. Chen, and S. Li,</w:t>
+      </w:r>
+      <w:r>
+        <w:t xml:space="preserve"> </w:t>
+      </w:r>
+      <w:r>
+        <w:t xml:space="preserve">“Reasoning aware self-consistency: Leveraging reasoning paths for efficient LLM sampling,”</w:t>
+      </w:r>
+      <w:r>
+        <w:t xml:space="preserve"> </w:t>
+      </w:r>
+      <w:r>
+        <w:t xml:space="preserve">in</w:t>
+      </w:r>
+      <w:r>
+        <w:t xml:space="preserve"> </w:t>
+      </w:r>
+      <w:r>
+        <w:rPr>
+          <w:i/>
+          <w:iCs/>
+        </w:rPr>
+        <w:t xml:space="preserve">Proc. NAACL</w:t>
+      </w:r>
+      <w:r>
+        <w:t xml:space="preserve">, 2025, pp. 3613–3635.</w:t>
+      </w:r>
+    </w:p>
+    <w:bookmarkEnd w:id="62"/>
     <w:sectPr>
       <w:footnotePr>
         <w:numRestart w:val="eachSect"/>

</xml_diff>

<commit_message>
Record TACT's sharpest unguarded failure mode in the limitations
The ISC follow-on produced a finding that matters more for TACT than for ISC:
crossing Prop. 4's boundary is worse than under-trust. In a paraphrased
wrong-majority cell -- a dominant wrong cluster that is semantically tight but
carries no verbatim signature, so deduplication has nothing to collapse -- the
plurality-error rate exceeds 1/2 and TACT-LF mis-signs, saturates at
gamma = -2.0, and scores 0.000 against an SC floor of 0.340, with none of the
four alarms firing (E1 keys on verbatim duplication, absent by construction).

The guarantee is conditional, the condition is not observable label-free, and
the diagnostics cannot detect its violation, so the limitation now recommends
the semi-label-free mode as the default wherever a systematically wrong
majority is plausible. Both language versions and all three output formats
rebuilt (the paper is now 8 pages).
</commit_message>
<xml_diff>
--- a/paper/tact.docx
+++ b/paper/tact.docx
@@ -15464,7 +15464,7 @@
           <w:b/>
           <w:bCs/>
         </w:rPr>
-        <w:t xml:space="preserve">Conditional label-free guarantee.</w:t>
+        <w:t xml:space="preserve">Conditional label-free guarantee, and what happens past the boundary.</w:t>
       </w:r>
       <w:r>
         <w:t xml:space="preserve"> </w:t>
@@ -15523,7 +15523,13 @@
         <w:t xml:space="preserve"> </w:t>
       </w:r>
       <w:r>
-        <w:t xml:space="preserve">after deduplication, and the confident-echo ambiguity is fundamental (Proposition </w:t>
+        <w:t xml:space="preserve">after deduplication, and the</w:t>
+      </w:r>
+      <w:r>
+        <w:t xml:space="preserve"> </w:t>
+      </w:r>
+      <w:r>
+        <w:t xml:space="preserve">confident-echo ambiguity is fundamental (Proposition </w:t>
       </w:r>
       <w:hyperlink w:anchor="prop:twoworld">
         <w:r>
@@ -15534,7 +15540,216 @@
         </w:r>
       </w:hyperlink>
       <w:r>
-        <w:t xml:space="preserve">); the alarms detect the verbatim case only, and paraphrased echo would evade them—the semi-label-free mode is the honest fix at</w:t>
+        <w:t xml:space="preserve">).</w:t>
+      </w:r>
+      <w:r>
+        <w:t xml:space="preserve"> </w:t>
+      </w:r>
+      <w:r>
+        <w:t xml:space="preserve">Follow-on work measured the consequence of crossing that boundary, and it is</w:t>
+      </w:r>
+      <w:r>
+        <w:t xml:space="preserve"> </w:t>
+      </w:r>
+      <w:r>
+        <w:t xml:space="preserve">worse than under-trust. In a</w:t>
+      </w:r>
+      <w:r>
+        <w:t xml:space="preserve"> </w:t>
+      </w:r>
+      <w:r>
+        <w:rPr>
+          <w:i/>
+          <w:iCs/>
+        </w:rPr>
+        <w:t xml:space="preserve">paraphrased</w:t>
+      </w:r>
+      <w:r>
+        <w:t xml:space="preserve"> </w:t>
+      </w:r>
+      <w:r>
+        <w:t xml:space="preserve">wrong-majority cell—a dominant</w:t>
+      </w:r>
+      <w:r>
+        <w:t xml:space="preserve"> </w:t>
+      </w:r>
+      <w:r>
+        <w:t xml:space="preserve">wrong cluster that is semantically tight but carries no verbatim signature, so</w:t>
+      </w:r>
+      <w:r>
+        <w:t xml:space="preserve"> </w:t>
+      </w:r>
+      <w:r>
+        <w:t xml:space="preserve">deduplication has nothing to collapse—the plurality is wrong on most items,</w:t>
+      </w:r>
+      <w:r>
+        <w:t xml:space="preserve"> </w:t>
+      </w:r>
+      <m:oMath>
+        <m:acc>
+          <m:accPr>
+            <m:chr m:val="‾"/>
+          </m:accPr>
+          <m:e>
+            <m:r>
+              <m:t>ρ</m:t>
+            </m:r>
+          </m:e>
+        </m:acc>
+        <m:r>
+          <m:rPr>
+            <m:sty m:val="p"/>
+          </m:rPr>
+          <m:t>&gt;</m:t>
+        </m:r>
+        <m:r>
+          <m:t>1</m:t>
+        </m:r>
+        <m:r>
+          <m:rPr>
+            <m:sty m:val="p"/>
+          </m:rPr>
+          <m:t>/</m:t>
+        </m:r>
+        <m:r>
+          <m:t>2</m:t>
+        </m:r>
+      </m:oMath>
+      <w:r>
+        <w:t xml:space="preserve">, and</w:t>
+      </w:r>
+      <w:r>
+        <w:t xml:space="preserve"> </w:t>
+      </w:r>
+      <w:r>
+        <w:rPr>
+          <w:smallCaps/>
+        </w:rPr>
+        <w:t xml:space="preserve">tact</w:t>
+      </w:r>
+      <w:r>
+        <w:t xml:space="preserve">-LF does not merely shrink toward</w:t>
+      </w:r>
+      <w:r>
+        <w:t xml:space="preserve"> </w:t>
+      </w:r>
+      <w:r>
+        <w:rPr>
+          <w:smallCaps/>
+        </w:rPr>
+        <w:t xml:space="preserve">sc</w:t>
+      </w:r>
+      <w:r>
+        <w:t xml:space="preserve">: it</w:t>
+      </w:r>
+      <w:r>
+        <w:t xml:space="preserve"> </w:t>
+      </w:r>
+      <w:r>
+        <w:rPr>
+          <w:i/>
+          <w:iCs/>
+        </w:rPr>
+        <w:t xml:space="preserve">mis-signs</w:t>
+      </w:r>
+      <w:r>
+        <w:t xml:space="preserve">, saturates at</w:t>
+      </w:r>
+      <w:r>
+        <w:t xml:space="preserve"> </w:t>
+      </w:r>
+      <m:oMath>
+        <m:r>
+          <m:t>γ</m:t>
+        </m:r>
+        <m:r>
+          <m:rPr>
+            <m:sty m:val="p"/>
+          </m:rPr>
+          <m:t>=</m:t>
+        </m:r>
+        <m:r>
+          <m:rPr>
+            <m:sty m:val="p"/>
+          </m:rPr>
+          <m:t>−</m:t>
+        </m:r>
+        <m:r>
+          <m:t>2.0</m:t>
+        </m:r>
+      </m:oMath>
+      <w:r>
+        <w:t xml:space="preserve">, and scores</w:t>
+      </w:r>
+      <w:r>
+        <w:t xml:space="preserve"> </w:t>
+      </w:r>
+      <m:oMath>
+        <m:r>
+          <m:t>0.000</m:t>
+        </m:r>
+      </m:oMath>
+      <w:r>
+        <w:t xml:space="preserve"> </w:t>
+      </w:r>
+      <w:r>
+        <w:t xml:space="preserve">against an</w:t>
+      </w:r>
+      <w:r>
+        <w:t xml:space="preserve"> </w:t>
+      </w:r>
+      <w:r>
+        <w:rPr>
+          <w:smallCaps/>
+        </w:rPr>
+        <w:t xml:space="preserve">sc</w:t>
+      </w:r>
+      <w:r>
+        <w:t xml:space="preserve"> </w:t>
+      </w:r>
+      <w:r>
+        <w:t xml:space="preserve">floor of</w:t>
+      </w:r>
+      <w:r>
+        <w:t xml:space="preserve"> </w:t>
+      </w:r>
+      <m:oMath>
+        <m:r>
+          <m:t>0.340</m:t>
+        </m:r>
+      </m:oMath>
+      <w:r>
+        <w:t xml:space="preserve">. None of the four alarms fires, because E1 keys on</w:t>
+      </w:r>
+      <w:r>
+        <w:t xml:space="preserve"> </w:t>
+      </w:r>
+      <w:r>
+        <w:t xml:space="preserve">verbatim duplication which is absent by construction. This is the method’s</w:t>
+      </w:r>
+      <w:r>
+        <w:t xml:space="preserve"> </w:t>
+      </w:r>
+      <w:r>
+        <w:t xml:space="preserve">sharpest unguarded failure mode: the guarantee is conditional, the condition is</w:t>
+      </w:r>
+      <w:r>
+        <w:t xml:space="preserve"> </w:t>
+      </w:r>
+      <w:r>
+        <w:t xml:space="preserve">not observable label-free, and the existing diagnostics do not detect its</w:t>
+      </w:r>
+      <w:r>
+        <w:t xml:space="preserve"> </w:t>
+      </w:r>
+      <w:r>
+        <w:t xml:space="preserve">violation. Where a systematically wrong majority is plausible, the</w:t>
+      </w:r>
+      <w:r>
+        <w:t xml:space="preserve"> </w:t>
+      </w:r>
+      <w:r>
+        <w:t xml:space="preserve">semi-label-free mode (sign from</w:t>
       </w:r>
       <w:r>
         <w:t xml:space="preserve"> </w:t>
@@ -15554,7 +15769,13 @@
         <w:t xml:space="preserve"> </w:t>
       </w:r>
       <w:r>
-        <w:t xml:space="preserve">labels.</w:t>
+        <w:t xml:space="preserve">labels) should be the default rather</w:t>
+      </w:r>
+      <w:r>
+        <w:t xml:space="preserve"> </w:t>
+      </w:r>
+      <w:r>
+        <w:t xml:space="preserve">than an optional refinement.</w:t>
       </w:r>
     </w:p>
     <w:p>

</xml_diff>

<commit_message>
Word files rebuilt with the thin-window section
</commit_message>
<xml_diff>
--- a/paper/tact.docx
+++ b/paper/tact.docx
@@ -321,6 +321,19 @@
         <w:t xml:space="preserve"> </w:t>
       </w:r>
       <w:r>
+        <w:t xml:space="preserve">(</w:t>
+      </w:r>
+      <w:r>
+        <w:rPr>
+          <w:b/>
+          <w:bCs/>
+        </w:rPr>
+        <w:t xml:space="preserve">wang2023selfconsistency?</w:t>
+      </w:r>
+      <w:r>
+        <w:t xml:space="preserve">)</w:t>
+      </w:r>
+      <w:r>
         <w:t xml:space="preserve"> </w:t>
       </w:r>
       <w:r>
@@ -344,6 +357,32 @@
         <w:t xml:space="preserve"> </w:t>
       </w:r>
       <w:r>
+        <w:t xml:space="preserve">(</w:t>
+      </w:r>
+      <w:r>
+        <w:rPr>
+          <w:b/>
+          <w:bCs/>
+        </w:rPr>
+        <w:t xml:space="preserve">tian2023just?</w:t>
+      </w:r>
+      <w:r>
+        <w:t xml:space="preserve">;</w:t>
+      </w:r>
+      <w:r>
+        <w:t xml:space="preserve"> </w:t>
+      </w:r>
+      <w:r>
+        <w:rPr>
+          <w:b/>
+          <w:bCs/>
+        </w:rPr>
+        <w:t xml:space="preserve">xiong2024can?</w:t>
+      </w:r>
+      <w:r>
+        <w:t xml:space="preserve">)</w:t>
+      </w:r>
+      <w:r>
         <w:t xml:space="preserve">, derived from token log-probabilities, or elicited as</w:t>
       </w:r>
       <w:r>
@@ -377,10 +416,36 @@
         <w:t xml:space="preserve"> </w:t>
       </w:r>
       <w:r>
+        <w:t xml:space="preserve">(</w:t>
+      </w:r>
+      <w:r>
+        <w:rPr>
+          <w:b/>
+          <w:bCs/>
+        </w:rPr>
+        <w:t xml:space="preserve">kadavath2022language?</w:t>
+      </w:r>
+      <w:r>
+        <w:t xml:space="preserve">)</w:t>
+      </w:r>
+      <w:r>
         <w:t xml:space="preserve">—a natural refinement is to weight votes by confidence. Confidence-Informed Self-Consistency (CISC)</w:t>
       </w:r>
       <w:r>
         <w:t xml:space="preserve"> </w:t>
+      </w:r>
+      <w:r>
+        <w:t xml:space="preserve">(</w:t>
+      </w:r>
+      <w:r>
+        <w:rPr>
+          <w:b/>
+          <w:bCs/>
+        </w:rPr>
+        <w:t xml:space="preserve">taubenfeld2025cisc?</w:t>
+      </w:r>
+      <w:r>
+        <w:t xml:space="preserve">)</w:t>
       </w:r>
       <w:r>
         <w:t xml:space="preserve"> </w:t>
@@ -428,10 +493,36 @@
         <w:t xml:space="preserve"> </w:t>
       </w:r>
       <w:r>
+        <w:t xml:space="preserve">(</w:t>
+      </w:r>
+      <w:r>
+        <w:rPr>
+          <w:b/>
+          <w:bCs/>
+        </w:rPr>
+        <w:t xml:space="preserve">reasc2026?</w:t>
+      </w:r>
+      <w:r>
+        <w:t xml:space="preserve">)</w:t>
+      </w:r>
+      <w:r>
         <w:t xml:space="preserve">, warmup-thresholded filtering</w:t>
       </w:r>
       <w:r>
         <w:t xml:space="preserve"> </w:t>
+      </w:r>
+      <w:r>
+        <w:t xml:space="preserve">(</w:t>
+      </w:r>
+      <w:r>
+        <w:rPr>
+          <w:b/>
+          <w:bCs/>
+        </w:rPr>
+        <w:t xml:space="preserve">deepconf2025?</w:t>
+      </w:r>
+      <w:r>
+        <w:t xml:space="preserve">)</w:t>
       </w:r>
       <w:r>
         <w:t xml:space="preserve">—is monotone</w:t>
@@ -506,6 +597,32 @@
         <w:t xml:space="preserve"> </w:t>
       </w:r>
       <w:r>
+        <w:t xml:space="preserve">(</w:t>
+      </w:r>
+      <w:r>
+        <w:rPr>
+          <w:b/>
+          <w:bCs/>
+        </w:rPr>
+        <w:t xml:space="preserve">taubenfeld2025cisc?</w:t>
+      </w:r>
+      <w:r>
+        <w:t xml:space="preserve">;</w:t>
+      </w:r>
+      <w:r>
+        <w:t xml:space="preserve"> </w:t>
+      </w:r>
+      <w:r>
+        <w:rPr>
+          <w:b/>
+          <w:bCs/>
+        </w:rPr>
+        <w:t xml:space="preserve">huang2024rankcalibration?</w:t>
+      </w:r>
+      <w:r>
+        <w:t xml:space="preserve">)</w:t>
+      </w:r>
+      <w:r>
         <w:t xml:space="preserve">.</w:t>
       </w:r>
     </w:p>
@@ -835,6 +952,32 @@
       </w:r>
       <w:r>
         <w:t xml:space="preserve"> </w:t>
+      </w:r>
+      <w:r>
+        <w:t xml:space="preserve">(</w:t>
+      </w:r>
+      <w:r>
+        <w:rPr>
+          <w:b/>
+          <w:bCs/>
+        </w:rPr>
+        <w:t xml:space="preserve">dawid1979maximum?</w:t>
+      </w:r>
+      <w:r>
+        <w:t xml:space="preserve">;</w:t>
+      </w:r>
+      <w:r>
+        <w:t xml:space="preserve"> </w:t>
+      </w:r>
+      <w:r>
+        <w:rPr>
+          <w:b/>
+          <w:bCs/>
+        </w:rPr>
+        <w:t xml:space="preserve">parisi2014ranking?</w:t>
+      </w:r>
+      <w:r>
+        <w:t xml:space="preserve">)</w:t>
       </w:r>
       <w:r>
         <w:t xml:space="preserve">; a single exchangeable confidence channel from one model offers no such structure. The signed discrimination is estimated from</w:t>
@@ -1276,6 +1419,19 @@
         <w:t xml:space="preserve"> </w:t>
       </w:r>
       <w:r>
+        <w:t xml:space="preserve">(</w:t>
+      </w:r>
+      <w:r>
+        <w:rPr>
+          <w:b/>
+          <w:bCs/>
+        </w:rPr>
+        <w:t xml:space="preserve">wang2023selfconsistency?</w:t>
+      </w:r>
+      <w:r>
+        <w:t xml:space="preserve">)</w:t>
+      </w:r>
+      <w:r>
         <w:t xml:space="preserve"> </w:t>
       </w:r>
       <w:r>
@@ -1285,6 +1441,19 @@
         <w:t xml:space="preserve"> </w:t>
       </w:r>
       <w:r>
+        <w:t xml:space="preserve">(</w:t>
+      </w:r>
+      <w:r>
+        <w:rPr>
+          <w:b/>
+          <w:bCs/>
+        </w:rPr>
+        <w:t xml:space="preserve">taubenfeld2025cisc?</w:t>
+      </w:r>
+      <w:r>
+        <w:t xml:space="preserve">)</w:t>
+      </w:r>
+      <w:r>
         <w:t xml:space="preserve"> </w:t>
       </w:r>
       <w:r>
@@ -1294,6 +1463,19 @@
         <w:t xml:space="preserve"> </w:t>
       </w:r>
       <w:r>
+        <w:t xml:space="preserve">(</w:t>
+      </w:r>
+      <w:r>
+        <w:rPr>
+          <w:b/>
+          <w:bCs/>
+        </w:rPr>
+        <w:t xml:space="preserve">huang2024rankcalibration?</w:t>
+      </w:r>
+      <w:r>
+        <w:t xml:space="preserve">)</w:t>
+      </w:r>
+      <w:r>
         <w:t xml:space="preserve"> </w:t>
       </w:r>
       <w:r>
@@ -1303,6 +1485,32 @@
         <w:t xml:space="preserve"> </w:t>
       </w:r>
       <w:r>
+        <w:t xml:space="preserve">(</w:t>
+      </w:r>
+      <w:r>
+        <w:rPr>
+          <w:b/>
+          <w:bCs/>
+        </w:rPr>
+        <w:t xml:space="preserve">li2023diverse?</w:t>
+      </w:r>
+      <w:r>
+        <w:t xml:space="preserve">;</w:t>
+      </w:r>
+      <w:r>
+        <w:t xml:space="preserve"> </w:t>
+      </w:r>
+      <w:r>
+        <w:rPr>
+          <w:b/>
+          <w:bCs/>
+        </w:rPr>
+        <w:t xml:space="preserve">borda2025?</w:t>
+      </w:r>
+      <w:r>
+        <w:t xml:space="preserve">)</w:t>
+      </w:r>
+      <w:r>
         <w:t xml:space="preserve"> </w:t>
       </w:r>
       <w:r>
@@ -1312,6 +1520,32 @@
         <w:t xml:space="preserve"> </w:t>
       </w:r>
       <w:r>
+        <w:t xml:space="preserve">(</w:t>
+      </w:r>
+      <w:r>
+        <w:rPr>
+          <w:b/>
+          <w:bCs/>
+        </w:rPr>
+        <w:t xml:space="preserve">aggarwal2023adaptive?</w:t>
+      </w:r>
+      <w:r>
+        <w:t xml:space="preserve">;</w:t>
+      </w:r>
+      <w:r>
+        <w:t xml:space="preserve"> </w:t>
+      </w:r>
+      <w:r>
+        <w:rPr>
+          <w:b/>
+          <w:bCs/>
+        </w:rPr>
+        <w:t xml:space="preserve">li2024escape?</w:t>
+      </w:r>
+      <w:r>
+        <w:t xml:space="preserve">)</w:t>
+      </w:r>
+      <w:r>
         <w:t xml:space="preserve"> </w:t>
       </w:r>
       <w:r>
@@ -1321,6 +1555,19 @@
         <w:t xml:space="preserve"> </w:t>
       </w:r>
       <w:r>
+        <w:t xml:space="preserve">(</w:t>
+      </w:r>
+      <w:r>
+        <w:rPr>
+          <w:b/>
+          <w:bCs/>
+        </w:rPr>
+        <w:t xml:space="preserve">reasc2026?</w:t>
+      </w:r>
+      <w:r>
+        <w:t xml:space="preserve">)</w:t>
+      </w:r>
+      <w:r>
         <w:t xml:space="preserve"> </w:t>
       </w:r>
       <w:r>
@@ -1328,6 +1575,19 @@
       </w:r>
       <w:r>
         <w:t xml:space="preserve"> </w:t>
+      </w:r>
+      <w:r>
+        <w:t xml:space="preserve">(</w:t>
+      </w:r>
+      <w:r>
+        <w:rPr>
+          <w:b/>
+          <w:bCs/>
+        </w:rPr>
+        <w:t xml:space="preserve">deepconf2025?</w:t>
+      </w:r>
+      <w:r>
+        <w:t xml:space="preserve">)</w:t>
       </w:r>
       <w:r>
         <w:t xml:space="preserve"> </w:t>
@@ -1389,12 +1649,64 @@
         <w:t xml:space="preserve"> </w:t>
       </w:r>
       <w:r>
+        <w:t xml:space="preserve">(</w:t>
+      </w:r>
+      <w:r>
+        <w:rPr>
+          <w:b/>
+          <w:bCs/>
+        </w:rPr>
+        <w:t xml:space="preserve">dawid1979maximum?</w:t>
+      </w:r>
+      <w:r>
+        <w:t xml:space="preserve">;</w:t>
+      </w:r>
+      <w:r>
+        <w:t xml:space="preserve"> </w:t>
+      </w:r>
+      <w:r>
+        <w:rPr>
+          <w:b/>
+          <w:bCs/>
+        </w:rPr>
+        <w:t xml:space="preserve">whitehill2009whose?</w:t>
+      </w:r>
+      <w:r>
+        <w:t xml:space="preserve">;</w:t>
+      </w:r>
+      <w:r>
+        <w:t xml:space="preserve"> </w:t>
+      </w:r>
+      <w:r>
+        <w:rPr>
+          <w:b/>
+          <w:bCs/>
+        </w:rPr>
+        <w:t xml:space="preserve">karger2011iterative?</w:t>
+      </w:r>
+      <w:r>
+        <w:t xml:space="preserve">)</w:t>
+      </w:r>
+      <w:r>
         <w:t xml:space="preserve">; spectral meta-learners</w:t>
       </w:r>
       <w:r>
         <w:t xml:space="preserve"> </w:t>
       </w:r>
       <w:r>
+        <w:t xml:space="preserve">(</w:t>
+      </w:r>
+      <w:r>
+        <w:rPr>
+          <w:b/>
+          <w:bCs/>
+        </w:rPr>
+        <w:t xml:space="preserve">parisi2014ranking?</w:t>
+      </w:r>
+      <w:r>
+        <w:t xml:space="preserve">)</w:t>
+      </w:r>
+      <w:r>
         <w:t xml:space="preserve"> </w:t>
       </w:r>
       <w:r>
@@ -1402,6 +1714,32 @@
       </w:r>
       <w:r>
         <w:t xml:space="preserve"> </w:t>
+      </w:r>
+      <w:r>
+        <w:t xml:space="preserve">(</w:t>
+      </w:r>
+      <w:r>
+        <w:rPr>
+          <w:b/>
+          <w:bCs/>
+        </w:rPr>
+        <w:t xml:space="preserve">fuse2026?</w:t>
+      </w:r>
+      <w:r>
+        <w:t xml:space="preserve">;</w:t>
+      </w:r>
+      <w:r>
+        <w:t xml:space="preserve"> </w:t>
+      </w:r>
+      <w:r>
+        <w:rPr>
+          <w:b/>
+          <w:bCs/>
+        </w:rPr>
+        <w:t xml:space="preserve">beyondmajority2025?</w:t>
+      </w:r>
+      <w:r>
+        <w:t xml:space="preserve">)</w:t>
       </w:r>
       <w:r>
         <w:t xml:space="preserve"> </w:t>
@@ -1447,16 +1785,68 @@
         <w:t xml:space="preserve"> </w:t>
       </w:r>
       <w:r>
+        <w:t xml:space="preserve">(</w:t>
+      </w:r>
+      <w:r>
+        <w:rPr>
+          <w:b/>
+          <w:bCs/>
+        </w:rPr>
+        <w:t xml:space="preserve">vanelteren1960?</w:t>
+      </w:r>
+      <w:r>
+        <w:t xml:space="preserve">)</w:t>
+      </w:r>
+      <w:r>
         <w:t xml:space="preserve">, the James–Stein positive-part estimator</w:t>
       </w:r>
       <w:r>
         <w:t xml:space="preserve"> </w:t>
       </w:r>
       <w:r>
+        <w:t xml:space="preserve">(</w:t>
+      </w:r>
+      <w:r>
+        <w:rPr>
+          <w:b/>
+          <w:bCs/>
+        </w:rPr>
+        <w:t xml:space="preserve">james1961estimation?</w:t>
+      </w:r>
+      <w:r>
+        <w:t xml:space="preserve">)</w:t>
+      </w:r>
+      <w:r>
         <w:t xml:space="preserve">, effective-sample-size corrections</w:t>
       </w:r>
       <w:r>
         <w:t xml:space="preserve"> </w:t>
+      </w:r>
+      <w:r>
+        <w:t xml:space="preserve">(</w:t>
+      </w:r>
+      <w:r>
+        <w:rPr>
+          <w:b/>
+          <w:bCs/>
+        </w:rPr>
+        <w:t xml:space="preserve">kish1965?</w:t>
+      </w:r>
+      <w:r>
+        <w:t xml:space="preserve">;</w:t>
+      </w:r>
+      <w:r>
+        <w:t xml:space="preserve"> </w:t>
+      </w:r>
+      <w:r>
+        <w:rPr>
+          <w:b/>
+          <w:bCs/>
+        </w:rPr>
+        <w:t xml:space="preserve">rao1981analysis?</w:t>
+      </w:r>
+      <w:r>
+        <w:t xml:space="preserve">)</w:t>
       </w:r>
       <w:r>
         <w:t xml:space="preserve">, and normal-scores discriminant analysis. The claim is the assembly and its anchors, not the parts.</w:t>
@@ -3763,6 +4153,19 @@
         <w:t xml:space="preserve"> </w:t>
       </w:r>
       <w:r>
+        <w:t xml:space="preserve">(</w:t>
+      </w:r>
+      <w:r>
+        <w:rPr>
+          <w:b/>
+          <w:bCs/>
+        </w:rPr>
+        <w:t xml:space="preserve">vanelteren1960?</w:t>
+      </w:r>
+      <w:r>
+        <w:t xml:space="preserve">)</w:t>
+      </w:r>
+      <w:r>
         <w:t xml:space="preserve">:</w:t>
       </w:r>
     </w:p>
@@ -5052,6 +5455,19 @@
         <w:t xml:space="preserve"> </w:t>
       </w:r>
       <w:r>
+        <w:t xml:space="preserve">(</w:t>
+      </w:r>
+      <w:r>
+        <w:rPr>
+          <w:b/>
+          <w:bCs/>
+        </w:rPr>
+        <w:t xml:space="preserve">james1961estimation?</w:t>
+      </w:r>
+      <w:r>
+        <w:t xml:space="preserve">)</w:t>
+      </w:r>
+      <w:r>
         <w:t xml:space="preserve">. The map is odd, continuous, never exceeds</w:t>
       </w:r>
       <w:r>
@@ -7536,6 +7952,19 @@
         <w:t xml:space="preserve"> </w:t>
       </w:r>
       <w:r>
+        <w:t xml:space="preserve">(</w:t>
+      </w:r>
+      <w:r>
+        <w:rPr>
+          <w:b/>
+          <w:bCs/>
+        </w:rPr>
+        <w:t xml:space="preserve">parisi2014ranking?</w:t>
+      </w:r>
+      <w:r>
+        <w:t xml:space="preserve">)</w:t>
+      </w:r>
+      <w:r>
         <w:t xml:space="preserve"> </w:t>
       </w:r>
       <w:r>
@@ -14416,6 +14845,19 @@
         <w:t xml:space="preserve"> </w:t>
       </w:r>
       <w:r>
+        <w:t xml:space="preserve">(</w:t>
+      </w:r>
+      <w:r>
+        <w:rPr>
+          <w:b/>
+          <w:bCs/>
+        </w:rPr>
+        <w:t xml:space="preserve">gsm8k2021?</w:t>
+      </w:r>
+      <w:r>
+        <w:t xml:space="preserve">)</w:t>
+      </w:r>
+      <w:r>
         <w:t xml:space="preserve">, 50 CommonsenseQA),</w:t>
       </w:r>
       <w:r>
@@ -15246,6 +15688,578 @@
         <w:pStyle w:val="BodyText"/>
       </w:pPr>
       <w:r>
+        <w:rPr>
+          <w:i/>
+          <w:iCs/>
+        </w:rPr>
+        <w:t xml:space="preserve">(e) A second campaign on harder items confirms the prediction of (c).</w:t>
+      </w:r>
+      <w:r>
+        <w:t xml:space="preserve"> </w:t>
+      </w:r>
+      <w:r>
+        <w:t xml:space="preserve">A pre-registered follow-up collected</w:t>
+      </w:r>
+      <w:r>
+        <w:t xml:space="preserve"> </w:t>
+      </w:r>
+      <m:oMath>
+        <m:r>
+          <m:t>119</m:t>
+        </m:r>
+      </m:oMath>
+      <w:r>
+        <w:t xml:space="preserve"> </w:t>
+      </w:r>
+      <w:r>
+        <w:t xml:space="preserve">MATH level-5 items</w:t>
+      </w:r>
+      <w:r>
+        <w:t xml:space="preserve"> </w:t>
+      </w:r>
+      <w:r>
+        <w:t xml:space="preserve">(</w:t>
+      </w:r>
+      <w:r>
+        <w:rPr>
+          <w:b/>
+          <w:bCs/>
+        </w:rPr>
+        <w:t xml:space="preserve">math500?</w:t>
+      </w:r>
+      <w:r>
+        <w:t xml:space="preserve">)</w:t>
+      </w:r>
+      <w:r>
+        <w:t xml:space="preserve"> </w:t>
+      </w:r>
+      <m:oMath>
+        <m:r>
+          <m:rPr>
+            <m:sty m:val="p"/>
+          </m:rPr>
+          <m:t>×</m:t>
+        </m:r>
+      </m:oMath>
+      <w:r>
+        <w:t xml:space="preserve"> </w:t>
+      </w:r>
+      <m:oMath>
+        <m:r>
+          <m:t>16</m:t>
+        </m:r>
+      </m:oMath>
+      <w:r>
+        <w:t xml:space="preserve"> </w:t>
+      </w:r>
+      <w:r>
+        <w:t xml:space="preserve">traces from the same frozen model (sign set</w:t>
+      </w:r>
+      <w:r>
+        <w:t xml:space="preserve"> </w:t>
+      </w:r>
+      <m:oMath>
+        <m:r>
+          <m:t>30</m:t>
+        </m:r>
+      </m:oMath>
+      <w:r>
+        <w:t xml:space="preserve">, evaluation set</w:t>
+      </w:r>
+      <w:r>
+        <w:t xml:space="preserve"> </w:t>
+      </w:r>
+      <m:oMath>
+        <m:r>
+          <m:t>89</m:t>
+        </m:r>
+      </m:oMath>
+      <w:r>
+        <w:t xml:space="preserve">). The channel prediction came true: pooled</w:t>
+      </w:r>
+      <w:r>
+        <w:t xml:space="preserve"> </w:t>
+      </w:r>
+      <m:oMath>
+        <m:acc>
+          <m:accPr>
+            <m:chr m:val="̂"/>
+          </m:accPr>
+          <m:e>
+            <m:r>
+              <m:t>D</m:t>
+            </m:r>
+          </m:e>
+        </m:acc>
+        <m:r>
+          <m:rPr>
+            <m:sty m:val="p"/>
+          </m:rPr>
+          <m:t>=</m:t>
+        </m:r>
+        <m:r>
+          <m:rPr>
+            <m:sty m:val="p"/>
+          </m:rPr>
+          <m:t>+</m:t>
+        </m:r>
+        <m:r>
+          <m:t>0.250</m:t>
+        </m:r>
+      </m:oMath>
+      <w:r>
+        <w:t xml:space="preserve">,</w:t>
+      </w:r>
+      <w:r>
+        <w:t xml:space="preserve"> </w:t>
+      </w:r>
+      <m:oMath>
+        <m:r>
+          <m:rPr>
+            <m:sty m:val="p"/>
+          </m:rPr>
+          <m:t>S</m:t>
+        </m:r>
+        <m:r>
+          <m:rPr>
+            <m:sty m:val="p"/>
+          </m:rPr>
+          <m:t>E</m:t>
+        </m:r>
+        <m:r>
+          <m:rPr>
+            <m:sty m:val="p"/>
+          </m:rPr>
+          <m:t>=</m:t>
+        </m:r>
+        <m:r>
+          <m:t>0.098</m:t>
+        </m:r>
+      </m:oMath>
+      <w:r>
+        <w:t xml:space="preserve"> </w:t>
+      </w:r>
+      <w:r>
+        <w:t xml:space="preserve">(</w:t>
+      </w:r>
+      <m:oMath>
+        <m:r>
+          <m:t>z</m:t>
+        </m:r>
+        <m:r>
+          <m:rPr>
+            <m:sty m:val="p"/>
+          </m:rPr>
+          <m:t>=</m:t>
+        </m:r>
+        <m:r>
+          <m:rPr>
+            <m:sty m:val="p"/>
+          </m:rPr>
+          <m:t>+</m:t>
+        </m:r>
+        <m:r>
+          <m:t>2.54</m:t>
+        </m:r>
+      </m:oMath>
+      <w:r>
+        <w:t xml:space="preserve">) — the first real-trace confirmation that the</w:t>
+      </w:r>
+      <w:r>
+        <w:t xml:space="preserve"> </w:t>
+      </w:r>
+      <w:r>
+        <w:t xml:space="preserve">verbalized-confidence channel carries positive within-item discrimination.</w:t>
+      </w:r>
+      <w:r>
+        <w:t xml:space="preserve"> </w:t>
+      </w:r>
+      <w:r>
+        <w:t xml:space="preserve">Saturation, however, still forecloses the aggregation endpoint: per-trace</w:t>
+      </w:r>
+      <w:r>
+        <w:t xml:space="preserve"> </w:t>
+      </w:r>
+      <w:r>
+        <w:t xml:space="preserve">accuracy is</w:t>
+      </w:r>
+      <w:r>
+        <w:t xml:space="preserve"> </w:t>
+      </w:r>
+      <m:oMath>
+        <m:r>
+          <m:t>0.819</m:t>
+        </m:r>
+      </m:oMath>
+      <w:r>
+        <w:t xml:space="preserve">,</w:t>
+      </w:r>
+      <w:r>
+        <w:t xml:space="preserve"> </w:t>
+      </w:r>
+      <w:r>
+        <w:rPr>
+          <w:smallCaps/>
+        </w:rPr>
+        <w:t xml:space="preserve">sc</w:t>
+      </w:r>
+      <w:r>
+        <w:t xml:space="preserve"> </w:t>
+      </w:r>
+      <w:r>
+        <w:t xml:space="preserve">scores</w:t>
+      </w:r>
+      <w:r>
+        <w:t xml:space="preserve"> </w:t>
+      </w:r>
+      <m:oMath>
+        <m:r>
+          <m:t>0.888</m:t>
+        </m:r>
+      </m:oMath>
+      <w:r>
+        <w:t xml:space="preserve">, the decisive stratum is</w:t>
+      </w:r>
+      <w:r>
+        <w:t xml:space="preserve"> </w:t>
+      </w:r>
+      <m:oMath>
+        <m:r>
+          <m:t>10</m:t>
+        </m:r>
+      </m:oMath>
+      <w:r>
+        <w:t xml:space="preserve"> </w:t>
+      </w:r>
+      <w:r>
+        <w:t xml:space="preserve">of</w:t>
+      </w:r>
+      <w:r>
+        <w:t xml:space="preserve"> </w:t>
+      </w:r>
+      <m:oMath>
+        <m:r>
+          <m:t>89</m:t>
+        </m:r>
+      </m:oMath>
+      <w:r>
+        <w:t xml:space="preserve"> </w:t>
+      </w:r>
+      <w:r>
+        <w:t xml:space="preserve">items, and the correct answer is present in the pool on only</w:t>
+      </w:r>
+      <w:r>
+        <w:t xml:space="preserve"> </w:t>
+      </w:r>
+      <m:oMath>
+        <m:r>
+          <m:t>4</m:t>
+        </m:r>
+      </m:oMath>
+      <w:r>
+        <w:t xml:space="preserve"> </w:t>
+      </w:r>
+      <w:r>
+        <w:t xml:space="preserve">of those –</w:t>
+      </w:r>
+      <w:r>
+        <w:t xml:space="preserve"> </w:t>
+      </w:r>
+      <w:r>
+        <w:t xml:space="preserve">so the in-pool</w:t>
+      </w:r>
+      <w:r>
+        <w:t xml:space="preserve"> </w:t>
+      </w:r>
+      <w:r>
+        <w:rPr>
+          <w:i/>
+          <w:iCs/>
+        </w:rPr>
+        <w:t xml:space="preserve">oracle</w:t>
+      </w:r>
+      <w:r>
+        <w:t xml:space="preserve"> </w:t>
+      </w:r>
+      <w:r>
+        <w:t xml:space="preserve">tops out at</w:t>
+      </w:r>
+      <w:r>
+        <w:t xml:space="preserve"> </w:t>
+      </w:r>
+      <m:oMath>
+        <m:r>
+          <m:rPr>
+            <m:sty m:val="p"/>
+          </m:rPr>
+          <m:t>+</m:t>
+        </m:r>
+        <m:r>
+          <m:t>4</m:t>
+        </m:r>
+        <m:r>
+          <m:rPr>
+            <m:sty m:val="p"/>
+          </m:rPr>
+          <m:t>/</m:t>
+        </m:r>
+        <m:r>
+          <m:rPr>
+            <m:sty m:val="p"/>
+          </m:rPr>
+          <m:t>−</m:t>
+        </m:r>
+        <m:r>
+          <m:t>0</m:t>
+        </m:r>
+      </m:oMath>
+      <w:r>
+        <w:t xml:space="preserve">, exact one-sided</w:t>
+      </w:r>
+      <w:r>
+        <w:t xml:space="preserve"> </w:t>
+      </w:r>
+      <m:oMath>
+        <m:r>
+          <m:t>p</m:t>
+        </m:r>
+        <m:r>
+          <m:rPr>
+            <m:sty m:val="p"/>
+          </m:rPr>
+          <m:t>=</m:t>
+        </m:r>
+        <m:r>
+          <m:t>0.0625</m:t>
+        </m:r>
+        <m:r>
+          <m:rPr>
+            <m:sty m:val="p"/>
+          </m:rPr>
+          <m:t>&gt;</m:t>
+        </m:r>
+        <m:r>
+          <m:t>0.05</m:t>
+        </m:r>
+      </m:oMath>
+      <w:r>
+        <w:t xml:space="preserve">: the registered endpoint was unpassable for</w:t>
+      </w:r>
+      <w:r>
+        <w:t xml:space="preserve"> </w:t>
+      </w:r>
+      <w:r>
+        <w:rPr>
+          <w:i/>
+          <w:iCs/>
+        </w:rPr>
+        <w:t xml:space="preserve">any</w:t>
+      </w:r>
+      <w:r>
+        <w:t xml:space="preserve"> </w:t>
+      </w:r>
+      <w:r>
+        <w:t xml:space="preserve">aggregation method on the realized substrate.</w:t>
+      </w:r>
+      <w:r>
+        <w:t xml:space="preserve"> </w:t>
+      </w:r>
+      <w:r>
+        <w:rPr>
+          <w:smallCaps/>
+        </w:rPr>
+        <w:t xml:space="preserve">tact</w:t>
+      </w:r>
+      <w:r>
+        <w:t xml:space="preserve"> </w:t>
+      </w:r>
+      <w:r>
+        <w:t xml:space="preserve">again abstained</w:t>
+      </w:r>
+      <w:r>
+        <w:t xml:space="preserve"> </w:t>
+      </w:r>
+      <w:r>
+        <w:t xml:space="preserve">correctly (</w:t>
+      </w:r>
+      <m:oMath>
+        <m:r>
+          <m:t>γ</m:t>
+        </m:r>
+        <m:r>
+          <m:rPr>
+            <m:sty m:val="p"/>
+          </m:rPr>
+          <m:t>=</m:t>
+        </m:r>
+        <m:r>
+          <m:t>0</m:t>
+        </m:r>
+      </m:oMath>
+      <w:r>
+        <w:t xml:space="preserve">; alarms E4 and E2 both fired on the label-free path,</w:t>
+      </w:r>
+      <w:r>
+        <w:t xml:space="preserve"> </w:t>
+      </w:r>
+      <w:r>
+        <w:t xml:space="preserve">and the</w:t>
+      </w:r>
+      <w:r>
+        <w:t xml:space="preserve"> </w:t>
+      </w:r>
+      <m:oMath>
+        <m:r>
+          <m:t>30</m:t>
+        </m:r>
+      </m:oMath>
+      <w:r>
+        <w:t xml:space="preserve">-item sign set contained too few informative items for the</w:t>
+      </w:r>
+      <w:r>
+        <w:t xml:space="preserve"> </w:t>
+      </w:r>
+      <w:r>
+        <w:t xml:space="preserve">semi-label-free sign), remaining bit-identical to</w:t>
+      </w:r>
+      <w:r>
+        <w:t xml:space="preserve"> </w:t>
+      </w:r>
+      <w:r>
+        <w:rPr>
+          <w:smallCaps/>
+        </w:rPr>
+        <w:t xml:space="preserve">sc</w:t>
+      </w:r>
+      <w:r>
+        <w:t xml:space="preserve"> </w:t>
+      </w:r>
+      <w:r>
+        <w:t xml:space="preserve">while the</w:t>
+      </w:r>
+      <w:r>
+        <w:t xml:space="preserve"> </w:t>
+      </w:r>
+      <w:r>
+        <w:t xml:space="preserve">best-single-confidence baseline lost</w:t>
+      </w:r>
+      <w:r>
+        <w:t xml:space="preserve"> </w:t>
+      </w:r>
+      <m:oMath>
+        <m:r>
+          <m:t>4.5</m:t>
+        </m:r>
+      </m:oMath>
+      <w:r>
+        <w:t xml:space="preserve"> </w:t>
+      </w:r>
+      <w:r>
+        <w:t xml:space="preserve">points by acting (</w:t>
+      </w:r>
+      <m:oMath>
+        <m:r>
+          <m:t>0.843</m:t>
+        </m:r>
+      </m:oMath>
+      <w:r>
+        <w:t xml:space="preserve">).</w:t>
+      </w:r>
+      <w:r>
+        <w:t xml:space="preserve"> </w:t>
+      </w:r>
+      <w:r>
+        <w:t xml:space="preserve">One methodological caveat from this campaign transfers beyond</w:t>
+      </w:r>
+      <w:r>
+        <w:t xml:space="preserve"> </w:t>
+      </w:r>
+      <w:r>
+        <w:rPr>
+          <w:smallCaps/>
+        </w:rPr>
+        <w:t xml:space="preserve">tact</w:t>
+      </w:r>
+      <w:r>
+        <w:t xml:space="preserve">:</w:t>
+      </w:r>
+      <w:r>
+        <w:t xml:space="preserve"> </w:t>
+      </w:r>
+      <w:r>
+        <w:t xml:space="preserve">measured difficulty depended strongly on the collection protocol — a</w:t>
+      </w:r>
+      <w:r>
+        <w:t xml:space="preserve"> </w:t>
+      </w:r>
+      <m:oMath>
+        <m:r>
+          <m:t>30</m:t>
+        </m:r>
+      </m:oMath>
+      <w:r>
+        <w:t xml:space="preserve">-problem-per-call probe put level-5 plurality accuracy at</w:t>
+      </w:r>
+      <w:r>
+        <w:t xml:space="preserve"> </w:t>
+      </w:r>
+      <m:oMath>
+        <m:r>
+          <m:t>0.40</m:t>
+        </m:r>
+      </m:oMath>
+      <w:r>
+        <w:t xml:space="preserve">, while</w:t>
+      </w:r>
+      <w:r>
+        <w:t xml:space="preserve"> </w:t>
+      </w:r>
+      <w:r>
+        <w:t xml:space="preserve">the</w:t>
+      </w:r>
+      <w:r>
+        <w:t xml:space="preserve"> </w:t>
+      </w:r>
+      <m:oMath>
+        <m:r>
+          <m:t>15</m:t>
+        </m:r>
+      </m:oMath>
+      <w:r>
+        <w:t xml:space="preserve">-problem-per-call confirmatory run yielded</w:t>
+      </w:r>
+      <w:r>
+        <w:t xml:space="preserve"> </w:t>
+      </w:r>
+      <m:oMath>
+        <m:r>
+          <m:t>0.888</m:t>
+        </m:r>
+      </m:oMath>
+      <w:r>
+        <w:t xml:space="preserve"> </w:t>
+      </w:r>
+      <w:r>
+        <w:t xml:space="preserve">on the same</w:t>
+      </w:r>
+      <w:r>
+        <w:t xml:space="preserve"> </w:t>
+      </w:r>
+      <w:r>
+        <w:t xml:space="preserve">stratum — so batch size must be reported as an experimental parameter</w:t>
+      </w:r>
+      <w:r>
+        <w:t xml:space="preserve"> </w:t>
+      </w:r>
+      <w:r>
+        <w:t xml:space="preserve">whenever traces are collected in batches.</w:t>
+      </w:r>
+    </w:p>
+    <w:p>
+      <w:pPr>
+        <w:pStyle w:val="BodyText"/>
+      </w:pPr>
+      <w:r>
         <w:t xml:space="preserve">Scope: one model, two benchmarks,</w:t>
       </w:r>
       <w:r>
@@ -15834,6 +16848,358 @@
       </w:r>
       <w:r>
         <w:t xml:space="preserve">unless further covariates exist.</w:t>
+      </w:r>
+    </w:p>
+    <w:p>
+      <w:pPr>
+        <w:pStyle w:val="BodyText"/>
+      </w:pPr>
+      <w:r>
+        <w:rPr>
+          <w:b/>
+          <w:bCs/>
+        </w:rPr>
+        <w:t xml:space="preserve">The thin window.</w:t>
+      </w:r>
+      <w:r>
+        <w:t xml:space="preserve"> </w:t>
+      </w:r>
+      <w:r>
+        <w:t xml:space="preserve">Measurements across three substrates (GSM8K/CSQA,</w:t>
+      </w:r>
+      <w:r>
+        <w:t xml:space="preserve"> </w:t>
+      </w:r>
+      <w:r>
+        <w:t xml:space="preserve">MATH level-5, AIME/AMC;</w:t>
+      </w:r>
+      <w:r>
+        <w:t xml:space="preserve"> </w:t>
+      </w:r>
+      <m:oMath>
+        <m:r>
+          <m:t>268</m:t>
+        </m:r>
+      </m:oMath>
+      <w:r>
+        <w:t xml:space="preserve"> </w:t>
+      </w:r>
+      <w:r>
+        <w:t xml:space="preserve">items with pools) place a structural bound on</w:t>
+      </w:r>
+      <w:r>
+        <w:t xml:space="preserve"> </w:t>
+      </w:r>
+      <w:r>
+        <w:t xml:space="preserve">this entire family of methods. The stratum any label-free aggregation method</w:t>
+      </w:r>
+      <w:r>
+        <w:t xml:space="preserve"> </w:t>
+      </w:r>
+      <w:r>
+        <w:t xml:space="preserve">can act on — plurality wrong</w:t>
+      </w:r>
+      <w:r>
+        <w:t xml:space="preserve"> </w:t>
+      </w:r>
+      <w:r>
+        <w:rPr>
+          <w:i/>
+          <w:iCs/>
+        </w:rPr>
+        <w:t xml:space="preserve">and</w:t>
+      </w:r>
+      <w:r>
+        <w:t xml:space="preserve"> </w:t>
+      </w:r>
+      <w:r>
+        <w:t xml:space="preserve">the correct answer present in the</w:t>
+      </w:r>
+      <w:r>
+        <w:t xml:space="preserve"> </w:t>
+      </w:r>
+      <w:r>
+        <w:t xml:space="preserve">pool</w:t>
+      </w:r>
+      <w:r>
+        <w:t xml:space="preserve"> </w:t>
+      </w:r>
+      <w:r>
+        <w:rPr>
+          <w:i/>
+          <w:iCs/>
+        </w:rPr>
+        <w:t xml:space="preserve">and</w:t>
+      </w:r>
+      <w:r>
+        <w:t xml:space="preserve"> </w:t>
+      </w:r>
+      <w:r>
+        <w:t xml:space="preserve">the signal separable — occupied</w:t>
+      </w:r>
+      <w:r>
+        <w:t xml:space="preserve"> </w:t>
+      </w:r>
+      <m:oMath>
+        <m:r>
+          <m:t>2</m:t>
+        </m:r>
+      </m:oMath>
+      <w:r>
+        <w:t xml:space="preserve">–</w:t>
+      </w:r>
+      <m:oMath>
+        <m:r>
+          <m:t>5</m:t>
+        </m:r>
+        <m:r>
+          <m:rPr>
+            <m:sty m:val="p"/>
+          </m:rPr>
+          <m:t>%</m:t>
+        </m:r>
+      </m:oMath>
+      <w:r>
+        <w:t xml:space="preserve"> </w:t>
+      </w:r>
+      <w:r>
+        <w:t xml:space="preserve">of items at</w:t>
+      </w:r>
+      <w:r>
+        <w:t xml:space="preserve"> </w:t>
+      </w:r>
+      <w:r>
+        <w:rPr>
+          <w:i/>
+          <w:iCs/>
+        </w:rPr>
+        <w:t xml:space="preserve">every</w:t>
+      </w:r>
+      <w:r>
+        <w:t xml:space="preserve"> </w:t>
+      </w:r>
+      <w:r>
+        <w:t xml:space="preserve">difficulty level: as items harden, they pass directly from</w:t>
+      </w:r>
+      <w:r>
+        <w:t xml:space="preserve"> </w:t>
+      </w:r>
+      <w:r>
+        <w:t xml:space="preserve">saturated (plurality right) to capability-limited (the correct answer never</w:t>
+      </w:r>
+      <w:r>
+        <w:t xml:space="preserve"> </w:t>
+      </w:r>
+      <w:r>
+        <w:t xml:space="preserve">sampled:</w:t>
+      </w:r>
+      <w:r>
+        <w:t xml:space="preserve"> </w:t>
+      </w:r>
+      <m:oMath>
+        <m:r>
+          <m:t>0</m:t>
+        </m:r>
+      </m:oMath>
+      <w:r>
+        <w:t xml:space="preserve"> </w:t>
+      </w:r>
+      <w:r>
+        <w:t xml:space="preserve">of</w:t>
+      </w:r>
+      <w:r>
+        <w:t xml:space="preserve"> </w:t>
+      </w:r>
+      <m:oMath>
+        <m:r>
+          <m:t>6</m:t>
+        </m:r>
+      </m:oMath>
+      <w:r>
+        <w:t xml:space="preserve"> </w:t>
+      </w:r>
+      <w:r>
+        <w:t xml:space="preserve">plurality-wrong AIME items had it in</w:t>
+      </w:r>
+      <w:r>
+        <w:t xml:space="preserve"> </w:t>
+      </w:r>
+      <m:oMath>
+        <m:r>
+          <m:t>16</m:t>
+        </m:r>
+      </m:oMath>
+      <w:r>
+        <w:t xml:space="preserve"> </w:t>
+      </w:r>
+      <w:r>
+        <w:t xml:space="preserve">draws), and the</w:t>
+      </w:r>
+      <w:r>
+        <w:t xml:space="preserve"> </w:t>
+      </w:r>
+      <w:r>
+        <w:t xml:space="preserve">addressable band between the two regimes does not widen. Classifying all</w:t>
+      </w:r>
+      <w:r>
+        <w:t xml:space="preserve"> </w:t>
+      </w:r>
+      <m:oMath>
+        <m:r>
+          <m:t>16</m:t>
+        </m:r>
+      </m:oMath>
+      <w:r>
+        <w:t xml:space="preserve"> </w:t>
+      </w:r>
+      <w:r>
+        <w:t xml:space="preserve">decisive items by error shape,</w:t>
+      </w:r>
+      <w:r>
+        <w:t xml:space="preserve"> </w:t>
+      </w:r>
+      <m:oMath>
+        <m:r>
+          <m:t>7</m:t>
+        </m:r>
+      </m:oMath>
+      <w:r>
+        <w:t xml:space="preserve"> </w:t>
+      </w:r>
+      <w:r>
+        <w:t xml:space="preserve">were stable-wrong (tight wrong cluster —</w:t>
+      </w:r>
+      <w:r>
+        <w:t xml:space="preserve"> </w:t>
+      </w:r>
+      <w:r>
+        <w:t xml:space="preserve">the two-world regime where no label-free signal can help) and</w:t>
+      </w:r>
+      <w:r>
+        <w:t xml:space="preserve"> </w:t>
+      </w:r>
+      <m:oMath>
+        <m:r>
+          <m:t>9</m:t>
+        </m:r>
+      </m:oMath>
+      <w:r>
+        <w:t xml:space="preserve"> </w:t>
+      </w:r>
+      <w:r>
+        <w:t xml:space="preserve">were</w:t>
+      </w:r>
+      <w:r>
+        <w:t xml:space="preserve"> </w:t>
+      </w:r>
+      <w:r>
+        <w:t xml:space="preserve">scattered (</w:t>
+      </w:r>
+      <m:oMath>
+        <m:r>
+          <m:t>6</m:t>
+        </m:r>
+      </m:oMath>
+      <w:r>
+        <w:t xml:space="preserve">–</w:t>
+      </w:r>
+      <m:oMath>
+        <m:r>
+          <m:t>8</m:t>
+        </m:r>
+      </m:oMath>
+      <w:r>
+        <w:t xml:space="preserve"> </w:t>
+      </w:r>
+      <w:r>
+        <w:t xml:space="preserve">distinct answers — a capability wall that diversity</w:t>
+      </w:r>
+      <w:r>
+        <w:t xml:space="preserve"> </w:t>
+      </w:r>
+      <w:r>
+        <w:t xml:space="preserve">interventions cannot cross, since diversity is already maximal). Under this</w:t>
+      </w:r>
+      <w:r>
+        <w:t xml:space="preserve"> </w:t>
+      </w:r>
+      <w:r>
+        <w:t xml:space="preserve">accounting, abstention is not a conservative compromise but the</w:t>
+      </w:r>
+      <w:r>
+        <w:t xml:space="preserve"> </w:t>
+      </w:r>
+      <w:r>
+        <w:rPr>
+          <w:i/>
+          <w:iCs/>
+        </w:rPr>
+        <w:t xml:space="preserve">only</w:t>
+      </w:r>
+      <w:r>
+        <w:t xml:space="preserve"> </w:t>
+      </w:r>
+      <w:r>
+        <w:t xml:space="preserve">correct default: on the confirmatory substrate the largest measured effect of</w:t>
+      </w:r>
+      <w:r>
+        <w:t xml:space="preserve"> </w:t>
+      </w:r>
+      <w:r>
+        <w:t xml:space="preserve">acting anyway was negative (the best-single-confidence baseline loses</w:t>
+      </w:r>
+      <w:r>
+        <w:t xml:space="preserve"> </w:t>
+      </w:r>
+      <m:oMath>
+        <m:r>
+          <m:t>4.5</m:t>
+        </m:r>
+      </m:oMath>
+      <w:r>
+        <w:t xml:space="preserve"> </w:t>
+      </w:r>
+      <w:r>
+        <w:t xml:space="preserve">points where</w:t>
+      </w:r>
+      <w:r>
+        <w:t xml:space="preserve"> </w:t>
+      </w:r>
+      <w:r>
+        <w:rPr>
+          <w:smallCaps/>
+        </w:rPr>
+        <w:t xml:space="preserve">tact</w:t>
+      </w:r>
+      <w:r>
+        <w:t xml:space="preserve">’s dead zone holds it exactly at the</w:t>
+      </w:r>
+      <w:r>
+        <w:t xml:space="preserve"> </w:t>
+      </w:r>
+      <w:r>
+        <w:rPr>
+          <w:smallCaps/>
+        </w:rPr>
+        <w:t xml:space="preserve">sc</w:t>
+      </w:r>
+      <w:r>
+        <w:t xml:space="preserve"> </w:t>
+      </w:r>
+      <w:r>
+        <w:t xml:space="preserve">floor). The</w:t>
+      </w:r>
+      <w:r>
+        <w:t xml:space="preserve"> </w:t>
+      </w:r>
+      <w:r>
+        <w:t xml:space="preserve">window widens only where an external anchor is cheap (executable tests,</w:t>
+      </w:r>
+      <w:r>
+        <w:t xml:space="preserve"> </w:t>
+      </w:r>
+      <w:r>
+        <w:t xml:space="preserve">substitution checks), which is where this program continues.</w:t>
       </w:r>
     </w:p>
     <w:bookmarkEnd w:id="62"/>

</xml_diff>

<commit_message>
Correct the paper's thin-window claim with the measurement that refutes it
The limitations section asserted that the window widens where an external
anchor is cheap, and named that as where the program continues. The G1
experiment tested exactly that and it does not hold: LeetCode Medium/Hard
measures 7.5% against 3.56% for HumanEval+/MBPP+ and 2-5% for label-free QA,
with the same composition (75% saturated, 18% capability wall, 8% rescuable)
and no response to candidate budget. Executable ground truth buys a slightly
wider window, not a different regime.

The thin window is now a two-domain, five-substrate result rather than a
QA-only one, which is a stronger statement than the paper previously made.
PDF and Word rebuilt; graveyard synthesis updated to match.
</commit_message>
<xml_diff>
--- a/paper/tact.docx
+++ b/paper/tact.docx
@@ -321,19 +321,6 @@
         <w:t xml:space="preserve"> </w:t>
       </w:r>
       <w:r>
-        <w:t xml:space="preserve">(</w:t>
-      </w:r>
-      <w:r>
-        <w:rPr>
-          <w:b/>
-          <w:bCs/>
-        </w:rPr>
-        <w:t xml:space="preserve">wang2023selfconsistency?</w:t>
-      </w:r>
-      <w:r>
-        <w:t xml:space="preserve">)</w:t>
-      </w:r>
-      <w:r>
         <w:t xml:space="preserve"> </w:t>
       </w:r>
       <w:r>
@@ -357,32 +344,6 @@
         <w:t xml:space="preserve"> </w:t>
       </w:r>
       <w:r>
-        <w:t xml:space="preserve">(</w:t>
-      </w:r>
-      <w:r>
-        <w:rPr>
-          <w:b/>
-          <w:bCs/>
-        </w:rPr>
-        <w:t xml:space="preserve">tian2023just?</w:t>
-      </w:r>
-      <w:r>
-        <w:t xml:space="preserve">;</w:t>
-      </w:r>
-      <w:r>
-        <w:t xml:space="preserve"> </w:t>
-      </w:r>
-      <w:r>
-        <w:rPr>
-          <w:b/>
-          <w:bCs/>
-        </w:rPr>
-        <w:t xml:space="preserve">xiong2024can?</w:t>
-      </w:r>
-      <w:r>
-        <w:t xml:space="preserve">)</w:t>
-      </w:r>
-      <w:r>
         <w:t xml:space="preserve">, derived from token log-probabilities, or elicited as</w:t>
       </w:r>
       <w:r>
@@ -416,36 +377,10 @@
         <w:t xml:space="preserve"> </w:t>
       </w:r>
       <w:r>
-        <w:t xml:space="preserve">(</w:t>
-      </w:r>
-      <w:r>
-        <w:rPr>
-          <w:b/>
-          <w:bCs/>
-        </w:rPr>
-        <w:t xml:space="preserve">kadavath2022language?</w:t>
-      </w:r>
-      <w:r>
-        <w:t xml:space="preserve">)</w:t>
-      </w:r>
-      <w:r>
         <w:t xml:space="preserve">—a natural refinement is to weight votes by confidence. Confidence-Informed Self-Consistency (CISC)</w:t>
       </w:r>
       <w:r>
         <w:t xml:space="preserve"> </w:t>
-      </w:r>
-      <w:r>
-        <w:t xml:space="preserve">(</w:t>
-      </w:r>
-      <w:r>
-        <w:rPr>
-          <w:b/>
-          <w:bCs/>
-        </w:rPr>
-        <w:t xml:space="preserve">taubenfeld2025cisc?</w:t>
-      </w:r>
-      <w:r>
-        <w:t xml:space="preserve">)</w:t>
       </w:r>
       <w:r>
         <w:t xml:space="preserve"> </w:t>
@@ -493,36 +428,10 @@
         <w:t xml:space="preserve"> </w:t>
       </w:r>
       <w:r>
-        <w:t xml:space="preserve">(</w:t>
-      </w:r>
-      <w:r>
-        <w:rPr>
-          <w:b/>
-          <w:bCs/>
-        </w:rPr>
-        <w:t xml:space="preserve">reasc2026?</w:t>
-      </w:r>
-      <w:r>
-        <w:t xml:space="preserve">)</w:t>
-      </w:r>
-      <w:r>
         <w:t xml:space="preserve">, warmup-thresholded filtering</w:t>
       </w:r>
       <w:r>
         <w:t xml:space="preserve"> </w:t>
-      </w:r>
-      <w:r>
-        <w:t xml:space="preserve">(</w:t>
-      </w:r>
-      <w:r>
-        <w:rPr>
-          <w:b/>
-          <w:bCs/>
-        </w:rPr>
-        <w:t xml:space="preserve">deepconf2025?</w:t>
-      </w:r>
-      <w:r>
-        <w:t xml:space="preserve">)</w:t>
       </w:r>
       <w:r>
         <w:t xml:space="preserve">—is monotone</w:t>
@@ -597,32 +506,6 @@
         <w:t xml:space="preserve"> </w:t>
       </w:r>
       <w:r>
-        <w:t xml:space="preserve">(</w:t>
-      </w:r>
-      <w:r>
-        <w:rPr>
-          <w:b/>
-          <w:bCs/>
-        </w:rPr>
-        <w:t xml:space="preserve">taubenfeld2025cisc?</w:t>
-      </w:r>
-      <w:r>
-        <w:t xml:space="preserve">;</w:t>
-      </w:r>
-      <w:r>
-        <w:t xml:space="preserve"> </w:t>
-      </w:r>
-      <w:r>
-        <w:rPr>
-          <w:b/>
-          <w:bCs/>
-        </w:rPr>
-        <w:t xml:space="preserve">huang2024rankcalibration?</w:t>
-      </w:r>
-      <w:r>
-        <w:t xml:space="preserve">)</w:t>
-      </w:r>
-      <w:r>
         <w:t xml:space="preserve">.</w:t>
       </w:r>
     </w:p>
@@ -952,32 +835,6 @@
       </w:r>
       <w:r>
         <w:t xml:space="preserve"> </w:t>
-      </w:r>
-      <w:r>
-        <w:t xml:space="preserve">(</w:t>
-      </w:r>
-      <w:r>
-        <w:rPr>
-          <w:b/>
-          <w:bCs/>
-        </w:rPr>
-        <w:t xml:space="preserve">dawid1979maximum?</w:t>
-      </w:r>
-      <w:r>
-        <w:t xml:space="preserve">;</w:t>
-      </w:r>
-      <w:r>
-        <w:t xml:space="preserve"> </w:t>
-      </w:r>
-      <w:r>
-        <w:rPr>
-          <w:b/>
-          <w:bCs/>
-        </w:rPr>
-        <w:t xml:space="preserve">parisi2014ranking?</w:t>
-      </w:r>
-      <w:r>
-        <w:t xml:space="preserve">)</w:t>
       </w:r>
       <w:r>
         <w:t xml:space="preserve">; a single exchangeable confidence channel from one model offers no such structure. The signed discrimination is estimated from</w:t>
@@ -1419,19 +1276,6 @@
         <w:t xml:space="preserve"> </w:t>
       </w:r>
       <w:r>
-        <w:t xml:space="preserve">(</w:t>
-      </w:r>
-      <w:r>
-        <w:rPr>
-          <w:b/>
-          <w:bCs/>
-        </w:rPr>
-        <w:t xml:space="preserve">wang2023selfconsistency?</w:t>
-      </w:r>
-      <w:r>
-        <w:t xml:space="preserve">)</w:t>
-      </w:r>
-      <w:r>
         <w:t xml:space="preserve"> </w:t>
       </w:r>
       <w:r>
@@ -1441,19 +1285,6 @@
         <w:t xml:space="preserve"> </w:t>
       </w:r>
       <w:r>
-        <w:t xml:space="preserve">(</w:t>
-      </w:r>
-      <w:r>
-        <w:rPr>
-          <w:b/>
-          <w:bCs/>
-        </w:rPr>
-        <w:t xml:space="preserve">taubenfeld2025cisc?</w:t>
-      </w:r>
-      <w:r>
-        <w:t xml:space="preserve">)</w:t>
-      </w:r>
-      <w:r>
         <w:t xml:space="preserve"> </w:t>
       </w:r>
       <w:r>
@@ -1463,19 +1294,6 @@
         <w:t xml:space="preserve"> </w:t>
       </w:r>
       <w:r>
-        <w:t xml:space="preserve">(</w:t>
-      </w:r>
-      <w:r>
-        <w:rPr>
-          <w:b/>
-          <w:bCs/>
-        </w:rPr>
-        <w:t xml:space="preserve">huang2024rankcalibration?</w:t>
-      </w:r>
-      <w:r>
-        <w:t xml:space="preserve">)</w:t>
-      </w:r>
-      <w:r>
         <w:t xml:space="preserve"> </w:t>
       </w:r>
       <w:r>
@@ -1485,32 +1303,6 @@
         <w:t xml:space="preserve"> </w:t>
       </w:r>
       <w:r>
-        <w:t xml:space="preserve">(</w:t>
-      </w:r>
-      <w:r>
-        <w:rPr>
-          <w:b/>
-          <w:bCs/>
-        </w:rPr>
-        <w:t xml:space="preserve">li2023diverse?</w:t>
-      </w:r>
-      <w:r>
-        <w:t xml:space="preserve">;</w:t>
-      </w:r>
-      <w:r>
-        <w:t xml:space="preserve"> </w:t>
-      </w:r>
-      <w:r>
-        <w:rPr>
-          <w:b/>
-          <w:bCs/>
-        </w:rPr>
-        <w:t xml:space="preserve">borda2025?</w:t>
-      </w:r>
-      <w:r>
-        <w:t xml:space="preserve">)</w:t>
-      </w:r>
-      <w:r>
         <w:t xml:space="preserve"> </w:t>
       </w:r>
       <w:r>
@@ -1520,32 +1312,6 @@
         <w:t xml:space="preserve"> </w:t>
       </w:r>
       <w:r>
-        <w:t xml:space="preserve">(</w:t>
-      </w:r>
-      <w:r>
-        <w:rPr>
-          <w:b/>
-          <w:bCs/>
-        </w:rPr>
-        <w:t xml:space="preserve">aggarwal2023adaptive?</w:t>
-      </w:r>
-      <w:r>
-        <w:t xml:space="preserve">;</w:t>
-      </w:r>
-      <w:r>
-        <w:t xml:space="preserve"> </w:t>
-      </w:r>
-      <w:r>
-        <w:rPr>
-          <w:b/>
-          <w:bCs/>
-        </w:rPr>
-        <w:t xml:space="preserve">li2024escape?</w:t>
-      </w:r>
-      <w:r>
-        <w:t xml:space="preserve">)</w:t>
-      </w:r>
-      <w:r>
         <w:t xml:space="preserve"> </w:t>
       </w:r>
       <w:r>
@@ -1555,19 +1321,6 @@
         <w:t xml:space="preserve"> </w:t>
       </w:r>
       <w:r>
-        <w:t xml:space="preserve">(</w:t>
-      </w:r>
-      <w:r>
-        <w:rPr>
-          <w:b/>
-          <w:bCs/>
-        </w:rPr>
-        <w:t xml:space="preserve">reasc2026?</w:t>
-      </w:r>
-      <w:r>
-        <w:t xml:space="preserve">)</w:t>
-      </w:r>
-      <w:r>
         <w:t xml:space="preserve"> </w:t>
       </w:r>
       <w:r>
@@ -1575,19 +1328,6 @@
       </w:r>
       <w:r>
         <w:t xml:space="preserve"> </w:t>
-      </w:r>
-      <w:r>
-        <w:t xml:space="preserve">(</w:t>
-      </w:r>
-      <w:r>
-        <w:rPr>
-          <w:b/>
-          <w:bCs/>
-        </w:rPr>
-        <w:t xml:space="preserve">deepconf2025?</w:t>
-      </w:r>
-      <w:r>
-        <w:t xml:space="preserve">)</w:t>
       </w:r>
       <w:r>
         <w:t xml:space="preserve"> </w:t>
@@ -1649,64 +1389,12 @@
         <w:t xml:space="preserve"> </w:t>
       </w:r>
       <w:r>
-        <w:t xml:space="preserve">(</w:t>
-      </w:r>
-      <w:r>
-        <w:rPr>
-          <w:b/>
-          <w:bCs/>
-        </w:rPr>
-        <w:t xml:space="preserve">dawid1979maximum?</w:t>
-      </w:r>
-      <w:r>
-        <w:t xml:space="preserve">;</w:t>
-      </w:r>
-      <w:r>
-        <w:t xml:space="preserve"> </w:t>
-      </w:r>
-      <w:r>
-        <w:rPr>
-          <w:b/>
-          <w:bCs/>
-        </w:rPr>
-        <w:t xml:space="preserve">whitehill2009whose?</w:t>
-      </w:r>
-      <w:r>
-        <w:t xml:space="preserve">;</w:t>
-      </w:r>
-      <w:r>
-        <w:t xml:space="preserve"> </w:t>
-      </w:r>
-      <w:r>
-        <w:rPr>
-          <w:b/>
-          <w:bCs/>
-        </w:rPr>
-        <w:t xml:space="preserve">karger2011iterative?</w:t>
-      </w:r>
-      <w:r>
-        <w:t xml:space="preserve">)</w:t>
-      </w:r>
-      <w:r>
         <w:t xml:space="preserve">; spectral meta-learners</w:t>
       </w:r>
       <w:r>
         <w:t xml:space="preserve"> </w:t>
       </w:r>
       <w:r>
-        <w:t xml:space="preserve">(</w:t>
-      </w:r>
-      <w:r>
-        <w:rPr>
-          <w:b/>
-          <w:bCs/>
-        </w:rPr>
-        <w:t xml:space="preserve">parisi2014ranking?</w:t>
-      </w:r>
-      <w:r>
-        <w:t xml:space="preserve">)</w:t>
-      </w:r>
-      <w:r>
         <w:t xml:space="preserve"> </w:t>
       </w:r>
       <w:r>
@@ -1714,32 +1402,6 @@
       </w:r>
       <w:r>
         <w:t xml:space="preserve"> </w:t>
-      </w:r>
-      <w:r>
-        <w:t xml:space="preserve">(</w:t>
-      </w:r>
-      <w:r>
-        <w:rPr>
-          <w:b/>
-          <w:bCs/>
-        </w:rPr>
-        <w:t xml:space="preserve">fuse2026?</w:t>
-      </w:r>
-      <w:r>
-        <w:t xml:space="preserve">;</w:t>
-      </w:r>
-      <w:r>
-        <w:t xml:space="preserve"> </w:t>
-      </w:r>
-      <w:r>
-        <w:rPr>
-          <w:b/>
-          <w:bCs/>
-        </w:rPr>
-        <w:t xml:space="preserve">beyondmajority2025?</w:t>
-      </w:r>
-      <w:r>
-        <w:t xml:space="preserve">)</w:t>
       </w:r>
       <w:r>
         <w:t xml:space="preserve"> </w:t>
@@ -1785,68 +1447,16 @@
         <w:t xml:space="preserve"> </w:t>
       </w:r>
       <w:r>
-        <w:t xml:space="preserve">(</w:t>
-      </w:r>
-      <w:r>
-        <w:rPr>
-          <w:b/>
-          <w:bCs/>
-        </w:rPr>
-        <w:t xml:space="preserve">vanelteren1960?</w:t>
-      </w:r>
-      <w:r>
-        <w:t xml:space="preserve">)</w:t>
-      </w:r>
-      <w:r>
         <w:t xml:space="preserve">, the James–Stein positive-part estimator</w:t>
       </w:r>
       <w:r>
         <w:t xml:space="preserve"> </w:t>
       </w:r>
       <w:r>
-        <w:t xml:space="preserve">(</w:t>
-      </w:r>
-      <w:r>
-        <w:rPr>
-          <w:b/>
-          <w:bCs/>
-        </w:rPr>
-        <w:t xml:space="preserve">james1961estimation?</w:t>
-      </w:r>
-      <w:r>
-        <w:t xml:space="preserve">)</w:t>
-      </w:r>
-      <w:r>
         <w:t xml:space="preserve">, effective-sample-size corrections</w:t>
       </w:r>
       <w:r>
         <w:t xml:space="preserve"> </w:t>
-      </w:r>
-      <w:r>
-        <w:t xml:space="preserve">(</w:t>
-      </w:r>
-      <w:r>
-        <w:rPr>
-          <w:b/>
-          <w:bCs/>
-        </w:rPr>
-        <w:t xml:space="preserve">kish1965?</w:t>
-      </w:r>
-      <w:r>
-        <w:t xml:space="preserve">;</w:t>
-      </w:r>
-      <w:r>
-        <w:t xml:space="preserve"> </w:t>
-      </w:r>
-      <w:r>
-        <w:rPr>
-          <w:b/>
-          <w:bCs/>
-        </w:rPr>
-        <w:t xml:space="preserve">rao1981analysis?</w:t>
-      </w:r>
-      <w:r>
-        <w:t xml:space="preserve">)</w:t>
       </w:r>
       <w:r>
         <w:t xml:space="preserve">, and normal-scores discriminant analysis. The claim is the assembly and its anchors, not the parts.</w:t>
@@ -4153,19 +3763,6 @@
         <w:t xml:space="preserve"> </w:t>
       </w:r>
       <w:r>
-        <w:t xml:space="preserve">(</w:t>
-      </w:r>
-      <w:r>
-        <w:rPr>
-          <w:b/>
-          <w:bCs/>
-        </w:rPr>
-        <w:t xml:space="preserve">vanelteren1960?</w:t>
-      </w:r>
-      <w:r>
-        <w:t xml:space="preserve">)</w:t>
-      </w:r>
-      <w:r>
         <w:t xml:space="preserve">:</w:t>
       </w:r>
     </w:p>
@@ -5455,19 +5052,6 @@
         <w:t xml:space="preserve"> </w:t>
       </w:r>
       <w:r>
-        <w:t xml:space="preserve">(</w:t>
-      </w:r>
-      <w:r>
-        <w:rPr>
-          <w:b/>
-          <w:bCs/>
-        </w:rPr>
-        <w:t xml:space="preserve">james1961estimation?</w:t>
-      </w:r>
-      <w:r>
-        <w:t xml:space="preserve">)</w:t>
-      </w:r>
-      <w:r>
         <w:t xml:space="preserve">. The map is odd, continuous, never exceeds</w:t>
       </w:r>
       <w:r>
@@ -7952,19 +7536,6 @@
         <w:t xml:space="preserve"> </w:t>
       </w:r>
       <w:r>
-        <w:t xml:space="preserve">(</w:t>
-      </w:r>
-      <w:r>
-        <w:rPr>
-          <w:b/>
-          <w:bCs/>
-        </w:rPr>
-        <w:t xml:space="preserve">parisi2014ranking?</w:t>
-      </w:r>
-      <w:r>
-        <w:t xml:space="preserve">)</w:t>
-      </w:r>
-      <w:r>
         <w:t xml:space="preserve"> </w:t>
       </w:r>
       <w:r>
@@ -14845,19 +14416,6 @@
         <w:t xml:space="preserve"> </w:t>
       </w:r>
       <w:r>
-        <w:t xml:space="preserve">(</w:t>
-      </w:r>
-      <w:r>
-        <w:rPr>
-          <w:b/>
-          <w:bCs/>
-        </w:rPr>
-        <w:t xml:space="preserve">gsm8k2021?</w:t>
-      </w:r>
-      <w:r>
-        <w:t xml:space="preserve">)</w:t>
-      </w:r>
-      <w:r>
         <w:t xml:space="preserve">, 50 CommonsenseQA),</w:t>
       </w:r>
       <w:r>
@@ -15718,19 +15276,6 @@
         <w:t xml:space="preserve"> </w:t>
       </w:r>
       <w:r>
-        <w:t xml:space="preserve">(</w:t>
-      </w:r>
-      <w:r>
-        <w:rPr>
-          <w:b/>
-          <w:bCs/>
-        </w:rPr>
-        <w:t xml:space="preserve">math500?</w:t>
-      </w:r>
-      <w:r>
-        <w:t xml:space="preserve">)</w:t>
-      </w:r>
-      <w:r>
         <w:t xml:space="preserve"> </w:t>
       </w:r>
       <m:oMath>
@@ -17187,19 +16732,373 @@
         <w:t xml:space="preserve"> </w:t>
       </w:r>
       <w:r>
-        <w:t xml:space="preserve">floor). The</w:t>
-      </w:r>
-      <w:r>
-        <w:t xml:space="preserve"> </w:t>
-      </w:r>
-      <w:r>
-        <w:t xml:space="preserve">window widens only where an external anchor is cheap (executable tests,</w:t>
-      </w:r>
-      <w:r>
-        <w:t xml:space="preserve"> </w:t>
-      </w:r>
-      <w:r>
-        <w:t xml:space="preserve">substitution checks), which is where this program continues.</w:t>
+        <w:t xml:space="preserve">floor).</w:t>
+      </w:r>
+    </w:p>
+    <w:p>
+      <w:pPr>
+        <w:pStyle w:val="BodyText"/>
+      </w:pPr>
+      <w:r>
+        <w:t xml:space="preserve">The natural hypothesis is that the window widens wherever an external anchor</w:t>
+      </w:r>
+      <w:r>
+        <w:t xml:space="preserve"> </w:t>
+      </w:r>
+      <w:r>
+        <w:t xml:space="preserve">is cheap, since a passing test is a real per-sample signal rather than a</w:t>
+      </w:r>
+      <w:r>
+        <w:t xml:space="preserve"> </w:t>
+      </w:r>
+      <w:r>
+        <w:t xml:space="preserve">model-relative one. That hypothesis was tested and does not hold. On</w:t>
+      </w:r>
+      <w:r>
+        <w:t xml:space="preserve"> </w:t>
+      </w:r>
+      <m:oMath>
+        <m:r>
+          <m:t>40</m:t>
+        </m:r>
+      </m:oMath>
+      <w:r>
+        <w:t xml:space="preserve"> </w:t>
+      </w:r>
+      <w:r>
+        <w:t xml:space="preserve">LeetCode Medium/Hard problems</w:t>
+      </w:r>
+      <w:r>
+        <w:t xml:space="preserve"> </w:t>
+      </w:r>
+      <w:r>
+        <w:t xml:space="preserve"> </w:t>
+      </w:r>
+      <w:r>
+        <w:t xml:space="preserve">with</w:t>
+      </w:r>
+      <w:r>
+        <w:t xml:space="preserve"> </w:t>
+      </w:r>
+      <m:oMath>
+        <m:r>
+          <m:t>8</m:t>
+        </m:r>
+      </m:oMath>
+      <w:r>
+        <w:t xml:space="preserve"> </w:t>
+      </w:r>
+      <w:r>
+        <w:t xml:space="preserve">candidate</w:t>
+      </w:r>
+      <w:r>
+        <w:t xml:space="preserve"> </w:t>
+      </w:r>
+      <w:r>
+        <w:t xml:space="preserve">solutions each, graded against the benchmark’s own hidden suites, the window</w:t>
+      </w:r>
+      <w:r>
+        <w:t xml:space="preserve"> </w:t>
+      </w:r>
+      <w:r>
+        <w:t xml:space="preserve">— oracle minus the largest-behavioural-cluster baseline — measures</w:t>
+      </w:r>
+      <w:r>
+        <w:t xml:space="preserve"> </w:t>
+      </w:r>
+      <m:oMath>
+        <m:r>
+          <m:t>3</m:t>
+        </m:r>
+        <m:r>
+          <m:rPr>
+            <m:sty m:val="p"/>
+          </m:rPr>
+          <m:t>/</m:t>
+        </m:r>
+        <m:r>
+          <m:t>40</m:t>
+        </m:r>
+        <m:r>
+          <m:rPr>
+            <m:sty m:val="p"/>
+          </m:rPr>
+          <m:t>=</m:t>
+        </m:r>
+        <m:r>
+          <m:t>7.5</m:t>
+        </m:r>
+        <m:r>
+          <m:rPr>
+            <m:sty m:val="p"/>
+          </m:rPr>
+          <m:t>%</m:t>
+        </m:r>
+      </m:oMath>
+      <w:r>
+        <w:t xml:space="preserve"> </w:t>
+      </w:r>
+      <w:r>
+        <w:t xml:space="preserve">(CI</w:t>
+      </w:r>
+      <m:oMath>
+        <m:sSub>
+          <m:e>
+            <m:r>
+              <m:t>​</m:t>
+            </m:r>
+          </m:e>
+          <m:sub>
+            <m:r>
+              <m:t>95</m:t>
+            </m:r>
+          </m:sub>
+        </m:sSub>
+      </m:oMath>
+      <w:r>
+        <w:t xml:space="preserve"> </w:t>
+      </w:r>
+      <m:oMath>
+        <m:r>
+          <m:t>2.6</m:t>
+        </m:r>
+      </m:oMath>
+      <w:r>
+        <w:t xml:space="preserve">–</w:t>
+      </w:r>
+      <m:oMath>
+        <m:r>
+          <m:t>19.9</m:t>
+        </m:r>
+        <m:r>
+          <m:rPr>
+            <m:sty m:val="p"/>
+          </m:rPr>
+          <m:t>%</m:t>
+        </m:r>
+      </m:oMath>
+      <w:r>
+        <w:t xml:space="preserve">), against</w:t>
+      </w:r>
+      <w:r>
+        <w:t xml:space="preserve"> </w:t>
+      </w:r>
+      <m:oMath>
+        <m:r>
+          <m:t>3.56</m:t>
+        </m:r>
+        <m:r>
+          <m:rPr>
+            <m:sty m:val="p"/>
+          </m:rPr>
+          <m:t>%</m:t>
+        </m:r>
+      </m:oMath>
+      <w:r>
+        <w:t xml:space="preserve"> </w:t>
+      </w:r>
+      <w:r>
+        <w:t xml:space="preserve">recomputed from</w:t>
+      </w:r>
+      <w:r>
+        <w:t xml:space="preserve"> </w:t>
+      </w:r>
+      <w:r>
+        <w:t xml:space="preserve">published HumanEval+/MBPP+ tables and</w:t>
+      </w:r>
+      <w:r>
+        <w:t xml:space="preserve"> </w:t>
+      </w:r>
+      <m:oMath>
+        <m:r>
+          <m:t>2</m:t>
+        </m:r>
+      </m:oMath>
+      <w:r>
+        <w:t xml:space="preserve">–</w:t>
+      </w:r>
+      <m:oMath>
+        <m:r>
+          <m:t>5</m:t>
+        </m:r>
+        <m:r>
+          <m:rPr>
+            <m:sty m:val="p"/>
+          </m:rPr>
+          <m:t>%</m:t>
+        </m:r>
+      </m:oMath>
+      <w:r>
+        <w:t xml:space="preserve"> </w:t>
+      </w:r>
+      <w:r>
+        <w:t xml:space="preserve">for label-free QA. The</w:t>
+      </w:r>
+      <w:r>
+        <w:t xml:space="preserve"> </w:t>
+      </w:r>
+      <w:r>
+        <w:t xml:space="preserve">composition is the same shape as well:</w:t>
+      </w:r>
+      <w:r>
+        <w:t xml:space="preserve"> </w:t>
+      </w:r>
+      <m:oMath>
+        <m:r>
+          <m:t>75</m:t>
+        </m:r>
+        <m:r>
+          <m:rPr>
+            <m:sty m:val="p"/>
+          </m:rPr>
+          <m:t>%</m:t>
+        </m:r>
+      </m:oMath>
+      <w:r>
+        <w:t xml:space="preserve"> </w:t>
+      </w:r>
+      <w:r>
+        <w:t xml:space="preserve">saturated,</w:t>
+      </w:r>
+      <w:r>
+        <w:t xml:space="preserve"> </w:t>
+      </w:r>
+      <m:oMath>
+        <m:r>
+          <m:t>18</m:t>
+        </m:r>
+        <m:r>
+          <m:rPr>
+            <m:sty m:val="p"/>
+          </m:rPr>
+          <m:t>%</m:t>
+        </m:r>
+      </m:oMath>
+      <w:r>
+        <w:t xml:space="preserve"> </w:t>
+      </w:r>
+      <w:r>
+        <w:t xml:space="preserve">capability</w:t>
+      </w:r>
+      <w:r>
+        <w:t xml:space="preserve"> </w:t>
+      </w:r>
+      <w:r>
+        <w:t xml:space="preserve">wall,</w:t>
+      </w:r>
+      <w:r>
+        <w:t xml:space="preserve"> </w:t>
+      </w:r>
+      <m:oMath>
+        <m:r>
+          <m:t>8</m:t>
+        </m:r>
+        <m:r>
+          <m:rPr>
+            <m:sty m:val="p"/>
+          </m:rPr>
+          <m:t>%</m:t>
+        </m:r>
+      </m:oMath>
+      <w:r>
+        <w:t xml:space="preserve"> </w:t>
+      </w:r>
+      <w:r>
+        <w:t xml:space="preserve">rescuable. Raising the candidate budget does not open it — the</w:t>
+      </w:r>
+      <w:r>
+        <w:t xml:space="preserve"> </w:t>
+      </w:r>
+      <w:r>
+        <w:t xml:space="preserve">seven capability-wall problems produced zero correct solutions in</w:t>
+      </w:r>
+      <w:r>
+        <w:t xml:space="preserve"> </w:t>
+      </w:r>
+      <m:oMath>
+        <m:r>
+          <m:t>224</m:t>
+        </m:r>
+      </m:oMath>
+      <w:r>
+        <w:t xml:space="preserve"> </w:t>
+      </w:r>
+      <w:r>
+        <w:t xml:space="preserve">further attempts (per-problem</w:t>
+      </w:r>
+      <w:r>
+        <w:t xml:space="preserve"> </w:t>
+      </w:r>
+      <m:oMath>
+        <m:r>
+          <m:t>95</m:t>
+        </m:r>
+        <m:r>
+          <m:rPr>
+            <m:sty m:val="p"/>
+          </m:rPr>
+          <m:t>%</m:t>
+        </m:r>
+      </m:oMath>
+      <w:r>
+        <w:t xml:space="preserve"> </w:t>
+      </w:r>
+      <w:r>
+        <w:t xml:space="preserve">upper bound on the pass rate</w:t>
+      </w:r>
+      <w:r>
+        <w:t xml:space="preserve"> </w:t>
+      </w:r>
+      <m:oMath>
+        <m:r>
+          <m:t>0.088</m:t>
+        </m:r>
+      </m:oMath>
+      <w:r>
+        <w:t xml:space="preserve">),</w:t>
+      </w:r>
+      <w:r>
+        <w:t xml:space="preserve"> </w:t>
+      </w:r>
+      <w:r>
+        <w:t xml:space="preserve">and extrapolating oracle@</w:t>
+      </w:r>
+      <m:oMath>
+        <m:r>
+          <m:t>N</m:t>
+        </m:r>
+      </m:oMath>
+      <w:r>
+        <w:t xml:space="preserve"> </w:t>
+      </w:r>
+      <w:r>
+        <w:t xml:space="preserve">shows the window saturating by</w:t>
+      </w:r>
+      <w:r>
+        <w:t xml:space="preserve"> </w:t>
+      </w:r>
+      <m:oMath>
+        <m:r>
+          <m:t>N</m:t>
+        </m:r>
+        <m:r>
+          <m:rPr>
+            <m:sty m:val="p"/>
+          </m:rPr>
+          <m:t>=</m:t>
+        </m:r>
+        <m:r>
+          <m:t>32</m:t>
+        </m:r>
+      </m:oMath>
+      <w:r>
+        <w:t xml:space="preserve">.</w:t>
+      </w:r>
+      <w:r>
+        <w:t xml:space="preserve"> </w:t>
+      </w:r>
+      <w:r>
+        <w:t xml:space="preserve">Executable ground truth buys a slightly wider window, not a different regime.</w:t>
       </w:r>
     </w:p>
     <w:bookmarkEnd w:id="62"/>

</xml_diff>

<commit_message>
Paper: add the budget axis as a Results subsection
Reports the paired budget-constrained run as exploratory, states the
manipulation check missed its own threshold, and gives the reason it is
reported anyway: the constraint moved items across the plurality boundary
rather than lowering accuracy uniformly, widening the window to 11.8% with
paired p = 0.0037 while strengthening the channel to z = 6.76.

The subsection ends on the finding that actually generalises. This is the
first substrate where the in-pool oracle clears the endpoint (+9/-0), TACT
still abstained via E4, and an upper-bound diagnostic with gold-estimated
gamma shows the abstention cost nothing: the best reachable is +4/-1 at
p = 0.19. Widening the window does not by itself make the gain reachable --
confidence weighting converts fewer than half the items the oracle can.
</commit_message>
<xml_diff>
--- a/paper/tact.docx
+++ b/paper/tact.docx
@@ -13553,7 +13553,7 @@
     </w:p>
     <w:bookmarkEnd w:id="52"/>
     <w:bookmarkEnd w:id="53"/>
-    <w:bookmarkStart w:id="75" w:name="sec:results"/>
+    <w:bookmarkStart w:id="76" w:name="sec:results"/>
     <w:p>
       <w:pPr>
         <w:pStyle w:val="Heading1"/>
@@ -20502,6 +20502,69 @@
           </w:p>
         </w:tc>
       </w:tr>
+      <w:tr>
+        <w:tc>
+          <w:tcPr/>
+          <w:p>
+            <w:pPr>
+              <w:pStyle w:val="Compact"/>
+              <w:jc w:val="left"/>
+            </w:pPr>
+            <w:r>
+              <w:t xml:space="preserve">QA, budget-constrained</w:t>
+            </w:r>
+          </w:p>
+        </w:tc>
+        <w:tc>
+          <w:tcPr/>
+          <w:p>
+            <w:pPr>
+              <w:pStyle w:val="Compact"/>
+              <w:jc w:val="left"/>
+            </w:pPr>
+            <w:r>
+              <w:t xml:space="preserve">MATH level-5</w:t>
+            </w:r>
+            <m:oMath>
+              <m:sSup>
+                <m:e>
+                  <m:r>
+                    <m:t>​</m:t>
+                  </m:r>
+                </m:e>
+                <m:sup>
+                  <m:r>
+                    <m:rPr>
+                      <m:sty m:val="p"/>
+                    </m:rPr>
+                    <m:t>†</m:t>
+                  </m:r>
+                </m:sup>
+              </m:sSup>
+            </m:oMath>
+          </w:p>
+        </w:tc>
+        <w:tc>
+          <w:tcPr/>
+          <w:p>
+            <w:pPr>
+              <w:pStyle w:val="Compact"/>
+              <w:jc w:val="center"/>
+            </w:pPr>
+            <m:oMath>
+              <m:r>
+                <m:t>11.8</m:t>
+              </m:r>
+              <m:r>
+                <m:rPr>
+                  <m:sty m:val="p"/>
+                </m:rPr>
+                <m:t>%</m:t>
+              </m:r>
+            </m:oMath>
+          </w:p>
+        </w:tc>
+      </w:tr>
     </w:tbl>
     <w:bookmarkEnd w:id="73"/>
     <w:p>
@@ -20609,8 +20672,750 @@
       </w:r>
     </w:p>
     <w:bookmarkEnd w:id="74"/>
+    <w:bookmarkStart w:id="75" w:name="sec:budget"/>
+    <w:p>
+      <w:pPr>
+        <w:pStyle w:val="Heading2"/>
+      </w:pPr>
+      <w:r>
+        <w:t xml:space="preserve">A third axis: reasoning budget</w:t>
+      </w:r>
+    </w:p>
+    <w:p>
+      <w:pPr>
+        <w:pStyle w:val="FirstParagraph"/>
+      </w:pPr>
+      <w:r>
+        <w:t xml:space="preserve">Difficulty is not the only way to lower per-sample accuracy. Constraining the</w:t>
+      </w:r>
+      <w:r>
+        <w:t xml:space="preserve"> </w:t>
+      </w:r>
+      <w:r>
+        <w:t xml:space="preserve">reasoning budget lowers it while leaving the correct answer inside the model’s</w:t>
+      </w:r>
+      <w:r>
+        <w:t xml:space="preserve"> </w:t>
+      </w:r>
+      <w:r>
+        <w:t xml:space="preserve">competence, which is the combination the decisive stratum needs and that</w:t>
+      </w:r>
+      <w:r>
+        <w:t xml:space="preserve"> </w:t>
+      </w:r>
+      <w:r>
+        <w:t xml:space="preserve">difficulty does not supply: as items harden they pass from saturated to</w:t>
+      </w:r>
+      <w:r>
+        <w:t xml:space="preserve"> </w:t>
+      </w:r>
+      <w:r>
+        <w:t xml:space="preserve">capability-limited without pausing in between. A paired run tests this on the</w:t>
+      </w:r>
+      <w:r>
+        <w:t xml:space="preserve"> </w:t>
+      </w:r>
+      <w:r>
+        <w:t xml:space="preserve">same</w:t>
+      </w:r>
+      <w:r>
+        <w:t xml:space="preserve"> </w:t>
+      </w:r>
+      <m:oMath>
+        <m:r>
+          <m:t>119</m:t>
+        </m:r>
+      </m:oMath>
+      <w:r>
+        <w:t xml:space="preserve"> </w:t>
+      </w:r>
+      <w:r>
+        <w:t xml:space="preserve">items, same model, same</w:t>
+      </w:r>
+      <w:r>
+        <w:t xml:space="preserve"> </w:t>
+      </w:r>
+      <m:oMath>
+        <m:r>
+          <m:t>K</m:t>
+        </m:r>
+      </m:oMath>
+      <w:r>
+        <w:t xml:space="preserve">, with the model instructed to answer</w:t>
+      </w:r>
+      <w:r>
+        <w:t xml:space="preserve"> </w:t>
+      </w:r>
+      <w:r>
+        <w:t xml:space="preserve">without writing any working.</w:t>
+      </w:r>
+    </w:p>
+    <w:p>
+      <w:pPr>
+        <w:pStyle w:val="BodyText"/>
+      </w:pPr>
+      <w:r>
+        <w:t xml:space="preserve">The manipulation was weaker than pre-registered on its stated check</w:t>
+      </w:r>
+      <w:r>
+        <w:t xml:space="preserve"> </w:t>
+      </w:r>
+      <w:r>
+        <w:t xml:space="preserve">(per-sample accuracy</w:t>
+      </w:r>
+      <w:r>
+        <w:t xml:space="preserve"> </w:t>
+      </w:r>
+      <m:oMath>
+        <m:r>
+          <m:t>0.853</m:t>
+        </m:r>
+        <m:r>
+          <m:rPr>
+            <m:sty m:val="p"/>
+          </m:rPr>
+          <m:t>→</m:t>
+        </m:r>
+        <m:r>
+          <m:t>0.781</m:t>
+        </m:r>
+      </m:oMath>
+      <w:r>
+        <w:t xml:space="preserve">, against a</w:t>
+      </w:r>
+      <w:r>
+        <w:t xml:space="preserve"> </w:t>
+      </w:r>
+      <m:oMath>
+        <m:r>
+          <m:t>0.10</m:t>
+        </m:r>
+      </m:oMath>
+      <w:r>
+        <w:t xml:space="preserve"> </w:t>
+      </w:r>
+      <w:r>
+        <w:t xml:space="preserve">drop required) and the</w:t>
+      </w:r>
+      <w:r>
+        <w:t xml:space="preserve"> </w:t>
+      </w:r>
+      <w:r>
+        <w:t xml:space="preserve">correct answer did not leave the pool (</w:t>
+      </w:r>
+      <m:oMath>
+        <m:r>
+          <m:t>0.950</m:t>
+        </m:r>
+        <m:r>
+          <m:rPr>
+            <m:sty m:val="p"/>
+          </m:rPr>
+          <m:t>→</m:t>
+        </m:r>
+        <m:r>
+          <m:t>0.933</m:t>
+        </m:r>
+      </m:oMath>
+      <w:r>
+        <w:t xml:space="preserve">), so what follows is</w:t>
+      </w:r>
+      <w:r>
+        <w:t xml:space="preserve"> </w:t>
+      </w:r>
+      <w:r>
+        <w:t xml:space="preserve">exploratory. It is reported because the constraint did not lower accuracy</w:t>
+      </w:r>
+      <w:r>
+        <w:t xml:space="preserve"> </w:t>
+      </w:r>
+      <w:r>
+        <w:t xml:space="preserve">uniformly, it moved items across the plurality boundary:</w:t>
+      </w:r>
+      <w:r>
+        <w:t xml:space="preserve"> </w:t>
+      </w:r>
+      <w:r>
+        <w:rPr>
+          <w:smallCaps/>
+        </w:rPr>
+        <w:t xml:space="preserve">sc</w:t>
+      </w:r>
+      <w:r>
+        <w:t xml:space="preserve"> </w:t>
+      </w:r>
+      <w:r>
+        <w:t xml:space="preserve">fell</w:t>
+      </w:r>
+      <w:r>
+        <w:t xml:space="preserve"> </w:t>
+      </w:r>
+      <m:oMath>
+        <m:r>
+          <m:t>0.924</m:t>
+        </m:r>
+        <m:r>
+          <m:rPr>
+            <m:sty m:val="p"/>
+          </m:rPr>
+          <m:t>→</m:t>
+        </m:r>
+        <m:r>
+          <m:t>0.815</m:t>
+        </m:r>
+      </m:oMath>
+      <w:r>
+        <w:t xml:space="preserve">, the window widened from</w:t>
+      </w:r>
+      <w:r>
+        <w:t xml:space="preserve"> </w:t>
+      </w:r>
+      <m:oMath>
+        <m:r>
+          <m:t>2.5</m:t>
+        </m:r>
+        <m:r>
+          <m:rPr>
+            <m:sty m:val="p"/>
+          </m:rPr>
+          <m:t>%</m:t>
+        </m:r>
+      </m:oMath>
+      <w:r>
+        <w:t xml:space="preserve"> </w:t>
+      </w:r>
+      <w:r>
+        <w:t xml:space="preserve">to</w:t>
+      </w:r>
+      <w:r>
+        <w:t xml:space="preserve"> </w:t>
+      </w:r>
+      <m:oMath>
+        <m:r>
+          <m:t>11.8</m:t>
+        </m:r>
+        <m:r>
+          <m:rPr>
+            <m:sty m:val="p"/>
+          </m:rPr>
+          <m:t>%</m:t>
+        </m:r>
+      </m:oMath>
+      <w:r>
+        <w:t xml:space="preserve"> </w:t>
+      </w:r>
+      <w:r>
+        <w:t xml:space="preserve">(paired exact McNemar on</w:t>
+      </w:r>
+      <w:r>
+        <w:t xml:space="preserve"> </w:t>
+      </w:r>
+      <w:r>
+        <w:t xml:space="preserve">window membership,</w:t>
+      </w:r>
+      <w:r>
+        <w:t xml:space="preserve"> </w:t>
+      </w:r>
+      <m:oMath>
+        <m:r>
+          <m:t>13</m:t>
+        </m:r>
+      </m:oMath>
+      <w:r>
+        <w:t xml:space="preserve"> </w:t>
+      </w:r>
+      <w:r>
+        <w:t xml:space="preserve">in and</w:t>
+      </w:r>
+      <w:r>
+        <w:t xml:space="preserve"> </w:t>
+      </w:r>
+      <m:oMath>
+        <m:r>
+          <m:t>2</m:t>
+        </m:r>
+      </m:oMath>
+      <w:r>
+        <w:t xml:space="preserve"> </w:t>
+      </w:r>
+      <w:r>
+        <w:t xml:space="preserve">out,</w:t>
+      </w:r>
+      <w:r>
+        <w:t xml:space="preserve"> </w:t>
+      </w:r>
+      <m:oMath>
+        <m:r>
+          <m:t>p</m:t>
+        </m:r>
+        <m:r>
+          <m:rPr>
+            <m:sty m:val="p"/>
+          </m:rPr>
+          <m:t>=</m:t>
+        </m:r>
+        <m:r>
+          <m:t>0.0037</m:t>
+        </m:r>
+      </m:oMath>
+      <w:r>
+        <w:t xml:space="preserve">), and the channel grew</w:t>
+      </w:r>
+      <w:r>
+        <w:t xml:space="preserve"> </w:t>
+      </w:r>
+      <w:r>
+        <w:rPr>
+          <w:i/>
+          <w:iCs/>
+        </w:rPr>
+        <w:t xml:space="preserve">stronger</w:t>
+      </w:r>
+      <w:r>
+        <w:t xml:space="preserve">,</w:t>
+      </w:r>
+      <w:r>
+        <w:t xml:space="preserve"> </w:t>
+      </w:r>
+      <m:oMath>
+        <m:acc>
+          <m:accPr>
+            <m:chr m:val="̂"/>
+          </m:accPr>
+          <m:e>
+            <m:r>
+              <m:t>D</m:t>
+            </m:r>
+          </m:e>
+        </m:acc>
+      </m:oMath>
+      <w:r>
+        <w:t xml:space="preserve"> </w:t>
+      </w:r>
+      <w:r>
+        <w:t xml:space="preserve">from</w:t>
+      </w:r>
+      <w:r>
+        <w:t xml:space="preserve"> </w:t>
+      </w:r>
+      <m:oMath>
+        <m:r>
+          <m:rPr>
+            <m:sty m:val="p"/>
+          </m:rPr>
+          <m:t>+</m:t>
+        </m:r>
+        <m:r>
+          <m:t>0.229</m:t>
+        </m:r>
+      </m:oMath>
+      <w:r>
+        <w:t xml:space="preserve"> </w:t>
+      </w:r>
+      <w:r>
+        <w:t xml:space="preserve">(</w:t>
+      </w:r>
+      <m:oMath>
+        <m:r>
+          <m:t>z</m:t>
+        </m:r>
+        <m:r>
+          <m:rPr>
+            <m:sty m:val="p"/>
+          </m:rPr>
+          <m:t>=</m:t>
+        </m:r>
+        <m:r>
+          <m:t>2.69</m:t>
+        </m:r>
+      </m:oMath>
+      <w:r>
+        <w:t xml:space="preserve">) to</w:t>
+      </w:r>
+      <w:r>
+        <w:t xml:space="preserve"> </w:t>
+      </w:r>
+      <m:oMath>
+        <m:r>
+          <m:rPr>
+            <m:sty m:val="p"/>
+          </m:rPr>
+          <m:t>+</m:t>
+        </m:r>
+        <m:r>
+          <m:t>0.398</m:t>
+        </m:r>
+      </m:oMath>
+      <w:r>
+        <w:t xml:space="preserve"> </w:t>
+      </w:r>
+      <w:r>
+        <w:t xml:space="preserve">(</w:t>
+      </w:r>
+      <m:oMath>
+        <m:r>
+          <m:t>z</m:t>
+        </m:r>
+        <m:r>
+          <m:rPr>
+            <m:sty m:val="p"/>
+          </m:rPr>
+          <m:t>=</m:t>
+        </m:r>
+        <m:r>
+          <m:t>6.76</m:t>
+        </m:r>
+      </m:oMath>
+      <w:r>
+        <w:t xml:space="preserve">).</w:t>
+      </w:r>
+      <w:r>
+        <w:t xml:space="preserve"> </w:t>
+      </w:r>
+      <w:r>
+        <w:t xml:space="preserve">Forced to answer without working, the model’s confidence tracks whether it</w:t>
+      </w:r>
+      <w:r>
+        <w:t xml:space="preserve"> </w:t>
+      </w:r>
+      <w:r>
+        <w:t xml:space="preserve">happened to be right.</w:t>
+      </w:r>
+    </w:p>
+    <w:p>
+      <w:pPr>
+        <w:pStyle w:val="BodyText"/>
+      </w:pPr>
+      <w:r>
+        <w:t xml:space="preserve">This is the widest window measured anywhere in this paper, and the first</w:t>
+      </w:r>
+      <w:r>
+        <w:t xml:space="preserve"> </w:t>
+      </w:r>
+      <w:r>
+        <w:t xml:space="preserve">substrate on which the in-pool oracle clears the endpoint at all (</w:t>
+      </w:r>
+      <m:oMath>
+        <m:r>
+          <m:rPr>
+            <m:sty m:val="p"/>
+          </m:rPr>
+          <m:t>+</m:t>
+        </m:r>
+        <m:r>
+          <m:t>9</m:t>
+        </m:r>
+        <m:r>
+          <m:rPr>
+            <m:sty m:val="p"/>
+          </m:rPr>
+          <m:t>/</m:t>
+        </m:r>
+        <m:r>
+          <m:rPr>
+            <m:sty m:val="p"/>
+          </m:rPr>
+          <m:t>−</m:t>
+        </m:r>
+        <m:r>
+          <m:t>0</m:t>
+        </m:r>
+      </m:oMath>
+      <w:r>
+        <w:t xml:space="preserve">,</w:t>
+      </w:r>
+      <w:r>
+        <w:t xml:space="preserve"> </w:t>
+      </w:r>
+      <m:oMath>
+        <m:r>
+          <m:t>p</m:t>
+        </m:r>
+        <m:r>
+          <m:rPr>
+            <m:sty m:val="p"/>
+          </m:rPr>
+          <m:t>=</m:t>
+        </m:r>
+        <m:r>
+          <m:t>0.002</m:t>
+        </m:r>
+      </m:oMath>
+      <w:r>
+        <w:t xml:space="preserve"> </w:t>
+      </w:r>
+      <w:r>
+        <w:t xml:space="preserve">on a decisive stratum of</w:t>
+      </w:r>
+      <w:r>
+        <w:t xml:space="preserve"> </w:t>
+      </w:r>
+      <m:oMath>
+        <m:r>
+          <m:t>17</m:t>
+        </m:r>
+      </m:oMath>
+      <w:r>
+        <w:t xml:space="preserve">).</w:t>
+      </w:r>
+      <w:r>
+        <w:t xml:space="preserve"> </w:t>
+      </w:r>
+      <w:r>
+        <w:rPr>
+          <w:smallCaps/>
+        </w:rPr>
+        <w:t xml:space="preserve">tact</w:t>
+      </w:r>
+      <w:r>
+        <w:t xml:space="preserve"> </w:t>
+      </w:r>
+      <w:r>
+        <w:t xml:space="preserve">nonetheless returned</w:t>
+      </w:r>
+      <w:r>
+        <w:t xml:space="preserve"> </w:t>
+      </w:r>
+      <m:oMath>
+        <m:r>
+          <m:t>γ</m:t>
+        </m:r>
+        <m:r>
+          <m:rPr>
+            <m:sty m:val="p"/>
+          </m:rPr>
+          <m:t>=</m:t>
+        </m:r>
+        <m:r>
+          <m:t>0</m:t>
+        </m:r>
+      </m:oMath>
+      <w:r>
+        <w:t xml:space="preserve">: only</w:t>
+      </w:r>
+      <w:r>
+        <w:t xml:space="preserve"> </w:t>
+      </w:r>
+      <m:oMath>
+        <m:r>
+          <m:t>12</m:t>
+        </m:r>
+      </m:oMath>
+      <w:r>
+        <w:t xml:space="preserve"> </w:t>
+      </w:r>
+      <w:r>
+        <w:t xml:space="preserve">items survived the margin gate against the threshold of</w:t>
+      </w:r>
+      <w:r>
+        <w:t xml:space="preserve"> </w:t>
+      </w:r>
+      <m:oMath>
+        <m:r>
+          <m:t>30</m:t>
+        </m:r>
+      </m:oMath>
+      <w:r>
+        <w:t xml:space="preserve">, so E4 fired. That abstention is testable rather than a matter of taste,</w:t>
+      </w:r>
+      <w:r>
+        <w:t xml:space="preserve"> </w:t>
+      </w:r>
+      <w:r>
+        <w:t xml:space="preserve">and it cost nothing. Estimating</w:t>
+      </w:r>
+      <w:r>
+        <w:t xml:space="preserve"> </w:t>
+      </w:r>
+      <m:oMath>
+        <m:r>
+          <m:t>γ</m:t>
+        </m:r>
+      </m:oMath>
+      <w:r>
+        <w:t xml:space="preserve"> </w:t>
+      </w:r>
+      <w:r>
+        <w:t xml:space="preserve">from gold labels, an upper bound no</w:t>
+      </w:r>
+      <w:r>
+        <w:t xml:space="preserve"> </w:t>
+      </w:r>
+      <w:r>
+        <w:t xml:space="preserve">deployable method has access to, the best available is</w:t>
+      </w:r>
+      <w:r>
+        <w:t xml:space="preserve"> </w:t>
+      </w:r>
+      <m:oMath>
+        <m:r>
+          <m:rPr>
+            <m:sty m:val="p"/>
+          </m:rPr>
+          <m:t>+</m:t>
+        </m:r>
+        <m:r>
+          <m:t>4</m:t>
+        </m:r>
+        <m:r>
+          <m:rPr>
+            <m:sty m:val="p"/>
+          </m:rPr>
+          <m:t>/</m:t>
+        </m:r>
+        <m:r>
+          <m:rPr>
+            <m:sty m:val="p"/>
+          </m:rPr>
+          <m:t>−</m:t>
+        </m:r>
+        <m:r>
+          <m:t>1</m:t>
+        </m:r>
+      </m:oMath>
+      <w:r>
+        <w:t xml:space="preserve"> </w:t>
+      </w:r>
+      <w:r>
+        <w:t xml:space="preserve">at</w:t>
+      </w:r>
+      <w:r>
+        <w:t xml:space="preserve"> </w:t>
+      </w:r>
+      <m:oMath>
+        <m:r>
+          <m:t>γ</m:t>
+        </m:r>
+        <m:r>
+          <m:rPr>
+            <m:sty m:val="p"/>
+          </m:rPr>
+          <m:t>=</m:t>
+        </m:r>
+        <m:r>
+          <m:t>1</m:t>
+        </m:r>
+      </m:oMath>
+      <w:r>
+        <w:t xml:space="preserve"> </w:t>
+      </w:r>
+      <w:r>
+        <w:t xml:space="preserve">(</w:t>
+      </w:r>
+      <m:oMath>
+        <m:r>
+          <m:t>p</m:t>
+        </m:r>
+        <m:r>
+          <m:rPr>
+            <m:sty m:val="p"/>
+          </m:rPr>
+          <m:t>=</m:t>
+        </m:r>
+        <m:r>
+          <m:t>0.19</m:t>
+        </m:r>
+      </m:oMath>
+      <w:r>
+        <w:t xml:space="preserve">); the derived</w:t>
+      </w:r>
+      <w:r>
+        <w:t xml:space="preserve"> </w:t>
+      </w:r>
+      <m:oMath>
+        <m:r>
+          <m:t>γ</m:t>
+        </m:r>
+        <m:r>
+          <m:rPr>
+            <m:sty m:val="p"/>
+          </m:rPr>
+          <m:t>=</m:t>
+        </m:r>
+        <m:r>
+          <m:t>0.670</m:t>
+        </m:r>
+      </m:oMath>
+      <w:r>
+        <w:t xml:space="preserve"> </w:t>
+      </w:r>
+      <w:r>
+        <w:t xml:space="preserve">gives</w:t>
+      </w:r>
+      <w:r>
+        <w:t xml:space="preserve"> </w:t>
+      </w:r>
+      <m:oMath>
+        <m:r>
+          <m:rPr>
+            <m:sty m:val="p"/>
+          </m:rPr>
+          <m:t>+</m:t>
+        </m:r>
+        <m:r>
+          <m:t>3</m:t>
+        </m:r>
+        <m:r>
+          <m:rPr>
+            <m:sty m:val="p"/>
+          </m:rPr>
+          <m:t>/</m:t>
+        </m:r>
+        <m:r>
+          <m:rPr>
+            <m:sty m:val="p"/>
+          </m:rPr>
+          <m:t>−</m:t>
+        </m:r>
+        <m:r>
+          <m:t>1</m:t>
+        </m:r>
+      </m:oMath>
+      <w:r>
+        <w:t xml:space="preserve">. The gap that matters is</w:t>
+      </w:r>
+      <w:r>
+        <w:t xml:space="preserve"> </w:t>
+      </w:r>
+      <w:r>
+        <w:t xml:space="preserve">therefore not the one the window closes. Even with the window at</w:t>
+      </w:r>
+      <w:r>
+        <w:t xml:space="preserve"> </w:t>
+      </w:r>
+      <m:oMath>
+        <m:r>
+          <m:t>11.8</m:t>
+        </m:r>
+        <m:r>
+          <m:rPr>
+            <m:sty m:val="p"/>
+          </m:rPr>
+          <m:t>%</m:t>
+        </m:r>
+      </m:oMath>
+      <w:r>
+        <w:t xml:space="preserve"> </w:t>
+      </w:r>
+      <w:r>
+        <w:t xml:space="preserve">and</w:t>
+      </w:r>
+      <w:r>
+        <w:t xml:space="preserve"> </w:t>
+      </w:r>
+      <w:r>
+        <w:t xml:space="preserve">an oracle able to convert nine items, confidence weighting reaches fewer than</w:t>
+      </w:r>
+      <w:r>
+        <w:t xml:space="preserve"> </w:t>
+      </w:r>
+      <w:r>
+        <w:t xml:space="preserve">half of them, and none of the reachable configurations is significant.</w:t>
+      </w:r>
+    </w:p>
     <w:bookmarkEnd w:id="75"/>
-    <w:bookmarkStart w:id="76" w:name="sec:limits"/>
+    <w:bookmarkEnd w:id="76"/>
+    <w:bookmarkStart w:id="77" w:name="sec:limits"/>
     <w:p>
       <w:pPr>
         <w:pStyle w:val="Heading1"/>
@@ -21437,8 +22242,8 @@
         <w:t xml:space="preserve">still reachable, and no pair tried here satisfies both.</w:t>
       </w:r>
     </w:p>
-    <w:bookmarkEnd w:id="76"/>
-    <w:bookmarkStart w:id="77" w:name="conclusion"/>
+    <w:bookmarkEnd w:id="77"/>
+    <w:bookmarkStart w:id="78" w:name="conclusion"/>
     <w:p>
       <w:pPr>
         <w:pStyle w:val="Heading1"/>
@@ -21476,8 +22281,8 @@
         <w:t xml:space="preserve">into a measured, signed, uncertainty-aware quantity with an exact fallback at one end, plain self-consistency whenever the evidence is absent, and an exact correspondence to CISC-power at the other under the log-value feature map (the shipped default uses van der Waerden scores, so that correspondence is a property of the family, not of the shipped configuration), and shows that the sign, long unrepresentable in this family of methods, can be recovered without any labels under stated and tested conditions. The accompanying impossibility results draw the boundary that any future per-item method must respect, and the falsification protocol, having already killed one of the author’s own systems, is offered as the more portable contribution.</w:t>
       </w:r>
     </w:p>
-    <w:bookmarkEnd w:id="77"/>
-    <w:bookmarkStart w:id="79" w:name="code-and-data-availability"/>
+    <w:bookmarkEnd w:id="78"/>
+    <w:bookmarkStart w:id="80" w:name="code-and-data-availability"/>
     <w:p>
       <w:pPr>
         <w:pStyle w:val="Heading1"/>
@@ -21496,7 +22301,7 @@
       <w:r>
         <w:t xml:space="preserve"> </w:t>
       </w:r>
-      <w:hyperlink r:id="rId78">
+      <w:hyperlink r:id="rId79">
         <w:r>
           <w:rPr>
             <w:rStyle w:val="Hyperlink"/>
@@ -21606,8 +22411,8 @@
         <w:t xml:space="preserve">writes the artifact its table cites.</w:t>
       </w:r>
     </w:p>
-    <w:bookmarkEnd w:id="79"/>
-    <w:bookmarkStart w:id="130" w:name="references"/>
+    <w:bookmarkEnd w:id="80"/>
+    <w:bookmarkStart w:id="131" w:name="references"/>
     <w:p>
       <w:pPr>
         <w:pStyle w:val="Heading1"/>
@@ -21628,8 +22433,8 @@
       <w:pPr>
         <w:pStyle w:val="BodyText"/>
       </w:pPr>
-      <w:bookmarkStart w:id="80" w:name="bib:wang2023selfconsistency"/>
-      <w:bookmarkEnd w:id="80"/>
+      <w:bookmarkStart w:id="81" w:name="bib:wang2023selfconsistency"/>
+      <w:bookmarkEnd w:id="81"/>
       <w:r>
         <w:t xml:space="preserve"> </w:t>
       </w:r>
@@ -21661,7 +22466,7 @@
       <w:r>
         <w:t xml:space="preserve">, 2023. </w:t>
       </w:r>
-      <w:hyperlink r:id="rId81">
+      <w:hyperlink r:id="rId82">
         <w:r>
           <w:rPr>
             <w:rStyle w:val="Hyperlink"/>
@@ -21674,8 +22479,8 @@
       <w:pPr>
         <w:pStyle w:val="BodyText"/>
       </w:pPr>
-      <w:bookmarkStart w:id="82" w:name="bib:tian2023just"/>
-      <w:bookmarkEnd w:id="82"/>
+      <w:bookmarkStart w:id="83" w:name="bib:tian2023just"/>
+      <w:bookmarkEnd w:id="83"/>
       <w:r>
         <w:t xml:space="preserve"> </w:t>
       </w:r>
@@ -21720,7 +22525,7 @@
       <w:r>
         <w:t xml:space="preserve">, 2023. </w:t>
       </w:r>
-      <w:hyperlink r:id="rId83">
+      <w:hyperlink r:id="rId84">
         <w:r>
           <w:rPr>
             <w:rStyle w:val="Hyperlink"/>
@@ -21733,8 +22538,8 @@
       <w:pPr>
         <w:pStyle w:val="BodyText"/>
       </w:pPr>
-      <w:bookmarkStart w:id="84" w:name="bib:xiong2024can"/>
-      <w:bookmarkEnd w:id="84"/>
+      <w:bookmarkStart w:id="85" w:name="bib:xiong2024can"/>
+      <w:bookmarkEnd w:id="85"/>
       <w:r>
         <w:t xml:space="preserve"> </w:t>
       </w:r>
@@ -21779,7 +22584,7 @@
       <w:r>
         <w:t xml:space="preserve">, 2024. </w:t>
       </w:r>
-      <w:hyperlink r:id="rId85">
+      <w:hyperlink r:id="rId86">
         <w:r>
           <w:rPr>
             <w:rStyle w:val="Hyperlink"/>
@@ -21792,8 +22597,8 @@
       <w:pPr>
         <w:pStyle w:val="BodyText"/>
       </w:pPr>
-      <w:bookmarkStart w:id="86" w:name="bib:kadavath2022language"/>
-      <w:bookmarkEnd w:id="86"/>
+      <w:bookmarkStart w:id="87" w:name="bib:kadavath2022language"/>
+      <w:bookmarkEnd w:id="87"/>
       <w:r>
         <w:t xml:space="preserve"> </w:t>
       </w:r>
@@ -21825,7 +22630,7 @@
       <w:r>
         <w:t xml:space="preserve">arXiv:2207.05221, 2022. </w:t>
       </w:r>
-      <w:hyperlink r:id="rId87">
+      <w:hyperlink r:id="rId88">
         <w:r>
           <w:rPr>
             <w:rStyle w:val="Hyperlink"/>
@@ -21838,8 +22643,8 @@
       <w:pPr>
         <w:pStyle w:val="BodyText"/>
       </w:pPr>
-      <w:bookmarkStart w:id="88" w:name="bib:taubenfeld2025cisc"/>
-      <w:bookmarkEnd w:id="88"/>
+      <w:bookmarkStart w:id="89" w:name="bib:taubenfeld2025cisc"/>
+      <w:bookmarkEnd w:id="89"/>
       <w:r>
         <w:t xml:space="preserve"> </w:t>
       </w:r>
@@ -21884,7 +22689,7 @@
       <w:r>
         <w:t xml:space="preserve">, 2025, arXiv:2502.06233. </w:t>
       </w:r>
-      <w:hyperlink r:id="rId89">
+      <w:hyperlink r:id="rId90">
         <w:r>
           <w:rPr>
             <w:rStyle w:val="Hyperlink"/>
@@ -21897,8 +22702,8 @@
       <w:pPr>
         <w:pStyle w:val="BodyText"/>
       </w:pPr>
-      <w:bookmarkStart w:id="90" w:name="bib:reasc2026"/>
-      <w:bookmarkEnd w:id="90"/>
+      <w:bookmarkStart w:id="91" w:name="bib:reasc2026"/>
+      <w:bookmarkEnd w:id="91"/>
       <w:r>
         <w:t xml:space="preserve"> </w:t>
       </w:r>
@@ -21930,7 +22735,7 @@
       <w:r>
         <w:t xml:space="preserve">, 2026, pp. 21575–21590. </w:t>
       </w:r>
-      <w:hyperlink r:id="rId91">
+      <w:hyperlink r:id="rId92">
         <w:r>
           <w:rPr>
             <w:rStyle w:val="Hyperlink"/>
@@ -21943,8 +22748,8 @@
       <w:pPr>
         <w:pStyle w:val="BodyText"/>
       </w:pPr>
-      <w:bookmarkStart w:id="92" w:name="bib:deepconf2025"/>
-      <w:bookmarkEnd w:id="92"/>
+      <w:bookmarkStart w:id="93" w:name="bib:deepconf2025"/>
+      <w:bookmarkEnd w:id="93"/>
       <w:r>
         <w:t xml:space="preserve"> </w:t>
       </w:r>
@@ -21976,7 +22781,7 @@
       <w:r>
         <w:t xml:space="preserve">arXiv:2508.15260, 2025. </w:t>
       </w:r>
-      <w:hyperlink r:id="rId93">
+      <w:hyperlink r:id="rId94">
         <w:r>
           <w:rPr>
             <w:rStyle w:val="Hyperlink"/>
@@ -21989,8 +22794,8 @@
       <w:pPr>
         <w:pStyle w:val="BodyText"/>
       </w:pPr>
-      <w:bookmarkStart w:id="94" w:name="bib:huang2024rankcalibration"/>
-      <w:bookmarkEnd w:id="94"/>
+      <w:bookmarkStart w:id="95" w:name="bib:huang2024rankcalibration"/>
+      <w:bookmarkEnd w:id="95"/>
       <w:r>
         <w:t xml:space="preserve"> </w:t>
       </w:r>
@@ -22022,7 +22827,7 @@
       <w:r>
         <w:t xml:space="preserve">, 2024, pp. 284–312. </w:t>
       </w:r>
-      <w:hyperlink r:id="rId95">
+      <w:hyperlink r:id="rId96">
         <w:r>
           <w:rPr>
             <w:rStyle w:val="Hyperlink"/>
@@ -22035,8 +22840,8 @@
       <w:pPr>
         <w:pStyle w:val="BodyText"/>
       </w:pPr>
-      <w:bookmarkStart w:id="96" w:name="bib:dawid1979maximum"/>
-      <w:bookmarkEnd w:id="96"/>
+      <w:bookmarkStart w:id="97" w:name="bib:dawid1979maximum"/>
+      <w:bookmarkEnd w:id="97"/>
       <w:r>
         <w:t xml:space="preserve"> </w:t>
       </w:r>
@@ -22062,7 +22867,7 @@
       <w:r>
         <w:t xml:space="preserve">, vol. 28, no. 1, pp. 20–28, 1979. </w:t>
       </w:r>
-      <w:hyperlink r:id="rId97">
+      <w:hyperlink r:id="rId98">
         <w:r>
           <w:rPr>
             <w:rStyle w:val="Hyperlink"/>
@@ -22075,8 +22880,8 @@
       <w:pPr>
         <w:pStyle w:val="BodyText"/>
       </w:pPr>
-      <w:bookmarkStart w:id="98" w:name="bib:parisi2014ranking"/>
-      <w:bookmarkEnd w:id="98"/>
+      <w:bookmarkStart w:id="99" w:name="bib:parisi2014ranking"/>
+      <w:bookmarkEnd w:id="99"/>
       <w:r>
         <w:t xml:space="preserve"> </w:t>
       </w:r>
@@ -22102,7 +22907,7 @@
       <w:r>
         <w:t xml:space="preserve">, vol. 111, no. 4, pp. 1253–1258, 2014. </w:t>
       </w:r>
-      <w:hyperlink r:id="rId99">
+      <w:hyperlink r:id="rId100">
         <w:r>
           <w:rPr>
             <w:rStyle w:val="Hyperlink"/>
@@ -22115,8 +22920,8 @@
       <w:pPr>
         <w:pStyle w:val="BodyText"/>
       </w:pPr>
-      <w:bookmarkStart w:id="100" w:name="bib:li2023diverse"/>
-      <w:bookmarkEnd w:id="100"/>
+      <w:bookmarkStart w:id="101" w:name="bib:li2023diverse"/>
+      <w:bookmarkEnd w:id="101"/>
       <w:r>
         <w:t xml:space="preserve"> </w:t>
       </w:r>
@@ -22161,7 +22966,7 @@
       <w:r>
         <w:t xml:space="preserve">, 2023. </w:t>
       </w:r>
-      <w:hyperlink r:id="rId101">
+      <w:hyperlink r:id="rId102">
         <w:r>
           <w:rPr>
             <w:rStyle w:val="Hyperlink"/>
@@ -22174,8 +22979,8 @@
       <w:pPr>
         <w:pStyle w:val="BodyText"/>
       </w:pPr>
-      <w:bookmarkStart w:id="102" w:name="bib:borda2025"/>
-      <w:bookmarkEnd w:id="102"/>
+      <w:bookmarkStart w:id="103" w:name="bib:borda2025"/>
+      <w:bookmarkEnd w:id="103"/>
       <w:r>
         <w:t xml:space="preserve"> </w:t>
       </w:r>
@@ -22207,7 +23012,7 @@
       <w:r>
         <w:t xml:space="preserve">, 2025, arXiv:2502.18581. </w:t>
       </w:r>
-      <w:hyperlink r:id="rId103">
+      <w:hyperlink r:id="rId104">
         <w:r>
           <w:rPr>
             <w:rStyle w:val="Hyperlink"/>
@@ -22220,8 +23025,8 @@
       <w:pPr>
         <w:pStyle w:val="BodyText"/>
       </w:pPr>
-      <w:bookmarkStart w:id="104" w:name="bib:aggarwal2023adaptive"/>
-      <w:bookmarkEnd w:id="104"/>
+      <w:bookmarkStart w:id="105" w:name="bib:aggarwal2023adaptive"/>
+      <w:bookmarkEnd w:id="105"/>
       <w:r>
         <w:t xml:space="preserve"> </w:t>
       </w:r>
@@ -22262,7 +23067,7 @@
       <w:r>
         <w:t xml:space="preserve">, 2023, pp. 12375–12396. </w:t>
       </w:r>
-      <w:hyperlink r:id="rId105">
+      <w:hyperlink r:id="rId106">
         <w:r>
           <w:rPr>
             <w:rStyle w:val="Hyperlink"/>
@@ -22275,8 +23080,8 @@
       <w:pPr>
         <w:pStyle w:val="BodyText"/>
       </w:pPr>
-      <w:bookmarkStart w:id="106" w:name="bib:li2024escape"/>
-      <w:bookmarkEnd w:id="106"/>
+      <w:bookmarkStart w:id="107" w:name="bib:li2024escape"/>
+      <w:bookmarkEnd w:id="107"/>
       <w:r>
         <w:t xml:space="preserve"> </w:t>
       </w:r>
@@ -22321,7 +23126,7 @@
       <w:r>
         <w:t xml:space="preserve">, 2024. </w:t>
       </w:r>
-      <w:hyperlink r:id="rId107">
+      <w:hyperlink r:id="rId108">
         <w:r>
           <w:rPr>
             <w:rStyle w:val="Hyperlink"/>
@@ -22334,8 +23139,8 @@
       <w:pPr>
         <w:pStyle w:val="BodyText"/>
       </w:pPr>
-      <w:bookmarkStart w:id="108" w:name="bib:whitehill2009whose"/>
-      <w:bookmarkEnd w:id="108"/>
+      <w:bookmarkStart w:id="109" w:name="bib:whitehill2009whose"/>
+      <w:bookmarkEnd w:id="109"/>
       <w:r>
         <w:t xml:space="preserve"> </w:t>
       </w:r>
@@ -22380,7 +23185,7 @@
       <w:r>
         <w:t xml:space="preserve">, 2009. </w:t>
       </w:r>
-      <w:hyperlink r:id="rId109">
+      <w:hyperlink r:id="rId110">
         <w:r>
           <w:rPr>
             <w:rStyle w:val="Hyperlink"/>
@@ -22393,8 +23198,8 @@
       <w:pPr>
         <w:pStyle w:val="BodyText"/>
       </w:pPr>
-      <w:bookmarkStart w:id="110" w:name="bib:karger2011iterative"/>
-      <w:bookmarkEnd w:id="110"/>
+      <w:bookmarkStart w:id="111" w:name="bib:karger2011iterative"/>
+      <w:bookmarkEnd w:id="111"/>
       <w:r>
         <w:t xml:space="preserve"> </w:t>
       </w:r>
@@ -22426,7 +23231,7 @@
       <w:r>
         <w:t xml:space="preserve">, 2011. </w:t>
       </w:r>
-      <w:hyperlink r:id="rId111">
+      <w:hyperlink r:id="rId112">
         <w:r>
           <w:rPr>
             <w:rStyle w:val="Hyperlink"/>
@@ -22439,8 +23244,8 @@
       <w:pPr>
         <w:pStyle w:val="BodyText"/>
       </w:pPr>
-      <w:bookmarkStart w:id="112" w:name="bib:fuse2026"/>
-      <w:bookmarkEnd w:id="112"/>
+      <w:bookmarkStart w:id="113" w:name="bib:fuse2026"/>
+      <w:bookmarkEnd w:id="113"/>
       <w:r>
         <w:t xml:space="preserve"> </w:t>
       </w:r>
@@ -22459,7 +23264,7 @@
       <w:r>
         <w:t xml:space="preserve">arXiv:2604.18547, 2026. </w:t>
       </w:r>
-      <w:hyperlink r:id="rId113">
+      <w:hyperlink r:id="rId114">
         <w:r>
           <w:rPr>
             <w:rStyle w:val="Hyperlink"/>
@@ -22472,8 +23277,8 @@
       <w:pPr>
         <w:pStyle w:val="BodyText"/>
       </w:pPr>
-      <w:bookmarkStart w:id="114" w:name="bib:beyondmajority2025"/>
-      <w:bookmarkEnd w:id="114"/>
+      <w:bookmarkStart w:id="115" w:name="bib:beyondmajority2025"/>
+      <w:bookmarkEnd w:id="115"/>
       <w:r>
         <w:t xml:space="preserve"> </w:t>
       </w:r>
@@ -22492,7 +23297,7 @@
       <w:r>
         <w:t xml:space="preserve">arXiv:2510.01499, 2025, accepted to ICML 2026. </w:t>
       </w:r>
-      <w:hyperlink r:id="rId115">
+      <w:hyperlink r:id="rId116">
         <w:r>
           <w:rPr>
             <w:rStyle w:val="Hyperlink"/>
@@ -22505,8 +23310,8 @@
       <w:pPr>
         <w:pStyle w:val="BodyText"/>
       </w:pPr>
-      <w:bookmarkStart w:id="116" w:name="bib:vanelteren1960"/>
-      <w:bookmarkEnd w:id="116"/>
+      <w:bookmarkStart w:id="117" w:name="bib:vanelteren1960"/>
+      <w:bookmarkEnd w:id="117"/>
       <w:r>
         <w:t xml:space="preserve"> </w:t>
       </w:r>
@@ -22532,7 +23337,7 @@
       <w:r>
         <w:t xml:space="preserve">, vol. 37, pp. 351–361, 1960. </w:t>
       </w:r>
-      <w:hyperlink r:id="rId117">
+      <w:hyperlink r:id="rId118">
         <w:r>
           <w:rPr>
             <w:rStyle w:val="Hyperlink"/>
@@ -22545,8 +23350,8 @@
       <w:pPr>
         <w:pStyle w:val="BodyText"/>
       </w:pPr>
-      <w:bookmarkStart w:id="118" w:name="bib:james1961estimation"/>
-      <w:bookmarkEnd w:id="118"/>
+      <w:bookmarkStart w:id="119" w:name="bib:james1961estimation"/>
+      <w:bookmarkEnd w:id="119"/>
       <w:r>
         <w:t xml:space="preserve"> </w:t>
       </w:r>
@@ -22578,7 +23383,7 @@
       <w:r>
         <w:t xml:space="preserve">, 1961, pp. 361–379. </w:t>
       </w:r>
-      <w:hyperlink r:id="rId119">
+      <w:hyperlink r:id="rId120">
         <w:r>
           <w:rPr>
             <w:rStyle w:val="Hyperlink"/>
@@ -22591,8 +23396,8 @@
       <w:pPr>
         <w:pStyle w:val="BodyText"/>
       </w:pPr>
-      <w:bookmarkStart w:id="120" w:name="bib:kish1965"/>
-      <w:bookmarkEnd w:id="120"/>
+      <w:bookmarkStart w:id="121" w:name="bib:kish1965"/>
+      <w:bookmarkEnd w:id="121"/>
       <w:r>
         <w:t xml:space="preserve"> </w:t>
       </w:r>
@@ -22612,7 +23417,7 @@
       <w:r>
         <w:t xml:space="preserve">. New York, NY, USA: Wiley, 1965. </w:t>
       </w:r>
-      <w:hyperlink r:id="rId121">
+      <w:hyperlink r:id="rId122">
         <w:r>
           <w:rPr>
             <w:rStyle w:val="Hyperlink"/>
@@ -22625,8 +23430,8 @@
       <w:pPr>
         <w:pStyle w:val="BodyText"/>
       </w:pPr>
-      <w:bookmarkStart w:id="122" w:name="bib:rao1981analysis"/>
-      <w:bookmarkEnd w:id="122"/>
+      <w:bookmarkStart w:id="123" w:name="bib:rao1981analysis"/>
+      <w:bookmarkEnd w:id="123"/>
       <w:r>
         <w:t xml:space="preserve"> </w:t>
       </w:r>
@@ -22652,7 +23457,7 @@
       <w:r>
         <w:t xml:space="preserve">, vol. 76, no. 374, pp. 221–230, 1981. </w:t>
       </w:r>
-      <w:hyperlink r:id="rId123">
+      <w:hyperlink r:id="rId124">
         <w:r>
           <w:rPr>
             <w:rStyle w:val="Hyperlink"/>
@@ -22665,8 +23470,8 @@
       <w:pPr>
         <w:pStyle w:val="BodyText"/>
       </w:pPr>
-      <w:bookmarkStart w:id="124" w:name="bib:gsm8k2021"/>
-      <w:bookmarkEnd w:id="124"/>
+      <w:bookmarkStart w:id="125" w:name="bib:gsm8k2021"/>
+      <w:bookmarkEnd w:id="125"/>
       <w:r>
         <w:t xml:space="preserve"> </w:t>
       </w:r>
@@ -22703,8 +23508,8 @@
       <w:pPr>
         <w:pStyle w:val="BodyText"/>
       </w:pPr>
-      <w:bookmarkStart w:id="125" w:name="bib:math500"/>
-      <w:bookmarkEnd w:id="125"/>
+      <w:bookmarkStart w:id="126" w:name="bib:math500"/>
+      <w:bookmarkEnd w:id="126"/>
       <w:r>
         <w:t xml:space="preserve"> </w:t>
       </w:r>
@@ -22749,7 +23554,7 @@
       <w:r>
         <w:t xml:space="preserve">, 2021. </w:t>
       </w:r>
-      <w:hyperlink r:id="rId126">
+      <w:hyperlink r:id="rId127">
         <w:r>
           <w:rPr>
             <w:rStyle w:val="Hyperlink"/>
@@ -22762,8 +23567,8 @@
       <w:pPr>
         <w:pStyle w:val="BodyText"/>
       </w:pPr>
-      <w:bookmarkStart w:id="127" w:name="bib:lightman2024verify"/>
-      <w:bookmarkEnd w:id="127"/>
+      <w:bookmarkStart w:id="128" w:name="bib:lightman2024verify"/>
+      <w:bookmarkEnd w:id="128"/>
       <w:r>
         <w:t xml:space="preserve"> </w:t>
       </w:r>
@@ -22813,8 +23618,8 @@
       <w:pPr>
         <w:pStyle w:val="BodyText"/>
       </w:pPr>
-      <w:bookmarkStart w:id="128" w:name="bib:leetcodedataset"/>
-      <w:bookmarkEnd w:id="128"/>
+      <w:bookmarkStart w:id="129" w:name="bib:leetcodedataset"/>
+      <w:bookmarkEnd w:id="129"/>
       <w:r>
         <w:t xml:space="preserve"> </w:t>
       </w:r>
@@ -22846,7 +23651,7 @@
       <w:r>
         <w:t xml:space="preserve">arXiv:2504.14655, 2025. </w:t>
       </w:r>
-      <w:hyperlink r:id="rId129">
+      <w:hyperlink r:id="rId130">
         <w:r>
           <w:rPr>
             <w:rStyle w:val="Hyperlink"/>
@@ -22855,7 +23660,7 @@
         </w:r>
       </w:hyperlink>
     </w:p>
-    <w:bookmarkEnd w:id="130"/>
+    <w:bookmarkEnd w:id="131"/>
     <w:sectPr>
       <w:footnotePr>
         <w:numRestart w:val="eachSect"/>

</xml_diff>

<commit_message>
Fix the two overfull boxes: the boxed formula and the window table
The one-expression display put the argmax vote and the clipped exponent side
by side, which overflowed the column by 54pt and cut the right-hand side off
the page. Split into an aligned two-line box, and the accompanying z-line
tightened, so the whole expression now sits inside the measure.

Table VI overflowed by 40pt after gaining a fourth column. Tightened to right-
aligned numeric columns with the per-cent sign moved to the caption and the
substrate names abbreviated.

Verified by rendering: zero overfull hboxes remain in the build, and pages 3
and 9 were inspected as images rather than trusting the absence of a warning.
</commit_message>
<xml_diff>
--- a/paper/tact.docx
+++ b/paper/tact.docx
@@ -7380,93 +7380,30 @@
               <m:r>
                 <m:t> </m:t>
               </m:r>
-              <m:sSub>
+              <m:eqArr>
                 <m:e>
-                  <m:acc>
-                    <m:accPr>
-                      <m:chr m:val="̂"/>
-                    </m:accPr>
-                    <m:e>
-                      <m:r>
-                        <m:t>a</m:t>
-                      </m:r>
-                    </m:e>
-                  </m:acc>
-                </m:e>
-                <m:sub>
-                  <m:r>
-                    <m:t>q</m:t>
-                  </m:r>
-                </m:sub>
-              </m:sSub>
-              <m:r>
-                <m:rPr>
-                  <m:sty m:val="p"/>
-                </m:rPr>
-                <m:t>=</m:t>
-              </m:r>
-              <m:r>
-                <m:rPr>
-                  <m:sty m:val="p"/>
-                </m:rPr>
-                <m:t>arg</m:t>
-              </m:r>
-              <m:limLow>
-                <m:e>
-                  <m:r>
-                    <m:rPr>
-                      <m:sty m:val="p"/>
-                    </m:rPr>
-                    <m:t>max</m:t>
-                  </m:r>
-                </m:e>
-                <m:lim>
-                  <m:r>
-                    <m:t>A</m:t>
-                  </m:r>
-                </m:lim>
-              </m:limLow>
-              <m:nary>
-                <m:naryPr>
-                  <m:chr m:val="∑"/>
-                  <m:limLoc m:val="undOvr"/>
-                  <m:subHide m:val="off"/>
-                  <m:supHide m:val="on"/>
-                </m:naryPr>
-                <m:sub>
-                  <m:r>
-                    <m:t>i</m:t>
-                  </m:r>
-                  <m:r>
-                    <m:rPr>
-                      <m:sty m:val="p"/>
-                    </m:rPr>
-                    <m:t>:</m:t>
-                  </m:r>
-                  <m:r>
-                    <m:t> </m:t>
-                  </m:r>
                   <m:sSub>
                     <m:e>
-                      <m:r>
-                        <m:t>a</m:t>
-                      </m:r>
+                      <m:acc>
+                        <m:accPr>
+                          <m:chr m:val="̂"/>
+                        </m:accPr>
+                        <m:e>
+                          <m:r>
+                            <m:t>a</m:t>
+                          </m:r>
+                        </m:e>
+                      </m:acc>
                     </m:e>
                     <m:sub>
                       <m:r>
                         <m:t>q</m:t>
                       </m:r>
-                      <m:r>
-                        <m:rPr>
-                          <m:sty m:val="p"/>
-                        </m:rPr>
-                        <m:t>,</m:t>
-                      </m:r>
-                      <m:r>
-                        <m:t>i</m:t>
-                      </m:r>
                     </m:sub>
                   </m:sSub>
+                  <m:r>
+                    <m:t>&amp;</m:t>
+                  </m:r>
                   <m:r>
                     <m:rPr>
                       <m:sty m:val="p"/>
@@ -7474,180 +7411,237 @@
                     <m:t>=</m:t>
                   </m:r>
                   <m:r>
-                    <m:t>A</m:t>
+                    <m:rPr>
+                      <m:sty m:val="p"/>
+                    </m:rPr>
+                    <m:t>arg</m:t>
                   </m:r>
-                </m:sub>
-                <m:sup>
-                  <m:r>
-                    <m:t>​</m:t>
-                  </m:r>
-                </m:sup>
-                <m:e>
+                  <m:limLow>
+                    <m:e>
+                      <m:r>
+                        <m:rPr>
+                          <m:sty m:val="p"/>
+                        </m:rPr>
+                        <m:t>max</m:t>
+                      </m:r>
+                    </m:e>
+                    <m:lim>
+                      <m:r>
+                        <m:t>A</m:t>
+                      </m:r>
+                    </m:lim>
+                  </m:limLow>
+                  <m:nary>
+                    <m:naryPr>
+                      <m:chr m:val="∑"/>
+                      <m:limLoc m:val="undOvr"/>
+                      <m:subHide m:val="off"/>
+                      <m:supHide m:val="on"/>
+                    </m:naryPr>
+                    <m:sub>
+                      <m:r>
+                        <m:t>i</m:t>
+                      </m:r>
+                      <m:r>
+                        <m:rPr>
+                          <m:sty m:val="p"/>
+                        </m:rPr>
+                        <m:t>:</m:t>
+                      </m:r>
+                      <m:r>
+                        <m:t> </m:t>
+                      </m:r>
+                      <m:sSub>
+                        <m:e>
+                          <m:r>
+                            <m:t>a</m:t>
+                          </m:r>
+                        </m:e>
+                        <m:sub>
+                          <m:r>
+                            <m:t>q</m:t>
+                          </m:r>
+                          <m:r>
+                            <m:rPr>
+                              <m:sty m:val="p"/>
+                            </m:rPr>
+                            <m:t>,</m:t>
+                          </m:r>
+                          <m:r>
+                            <m:t>i</m:t>
+                          </m:r>
+                        </m:sub>
+                      </m:sSub>
+                      <m:r>
+                        <m:rPr>
+                          <m:sty m:val="p"/>
+                        </m:rPr>
+                        <m:t>=</m:t>
+                      </m:r>
+                      <m:r>
+                        <m:t>A</m:t>
+                      </m:r>
+                    </m:sub>
+                    <m:sup>
+                      <m:r>
+                        <m:t>​</m:t>
+                      </m:r>
+                    </m:sup>
+                    <m:e>
+                      <m:r>
+                        <m:rPr>
+                          <m:sty m:val="p"/>
+                        </m:rPr>
+                        <m:t>exp</m:t>
+                      </m:r>
+                    </m:e>
+                  </m:nary>
+                  <m:d>
+                    <m:dPr>
+                      <m:begChr m:val="("/>
+                      <m:sepChr m:val=""/>
+                      <m:endChr m:val=")"/>
+                      <m:grow/>
+                    </m:dPr>
+                    <m:e>
+                      <m:r>
+                        <m:t>γ</m:t>
+                      </m:r>
+                      <m:r>
+                        <m:t> </m:t>
+                      </m:r>
+                      <m:sSub>
+                        <m:e>
+                          <m:r>
+                            <m:t>φ</m:t>
+                          </m:r>
+                        </m:e>
+                        <m:sub>
+                          <m:r>
+                            <m:t>q</m:t>
+                          </m:r>
+                          <m:r>
+                            <m:rPr>
+                              <m:sty m:val="p"/>
+                            </m:rPr>
+                            <m:t>,</m:t>
+                          </m:r>
+                          <m:r>
+                            <m:t>i</m:t>
+                          </m:r>
+                        </m:sub>
+                      </m:sSub>
+                    </m:e>
+                  </m:d>
                   <m:r>
                     <m:rPr>
                       <m:sty m:val="p"/>
                     </m:rPr>
-                    <m:t>exp</m:t>
+                    <m:t>,</m:t>
                   </m:r>
                 </m:e>
-              </m:nary>
-              <m:d>
-                <m:dPr>
-                  <m:begChr m:val="("/>
-                  <m:sepChr m:val=""/>
-                  <m:endChr m:val=")"/>
-                  <m:grow/>
-                </m:dPr>
                 <m:e>
                   <m:r>
                     <m:t>γ</m:t>
                   </m:r>
                   <m:r>
-                    <m:t> </m:t>
+                    <m:t>&amp;</m:t>
                   </m:r>
-                  <m:sSub>
+                  <m:r>
+                    <m:rPr>
+                      <m:sty m:val="p"/>
+                    </m:rPr>
+                    <m:t>=</m:t>
+                  </m:r>
+                  <m:r>
+                    <m:rPr>
+                      <m:sty m:val="p"/>
+                    </m:rPr>
+                    <m:t>[</m:t>
+                  </m:r>
+                  <m:r>
+                    <m:t>z</m:t>
+                  </m:r>
+                  <m:rad>
+                    <m:radPr>
+                      <m:degHide m:val="on"/>
+                    </m:radPr>
+                    <m:deg/>
                     <m:e>
                       <m:r>
-                        <m:t>φ</m:t>
-                      </m:r>
-                    </m:e>
-                    <m:sub>
-                      <m:r>
-                        <m:t>q</m:t>
+                        <m:t>2</m:t>
                       </m:r>
                       <m:r>
                         <m:rPr>
                           <m:sty m:val="p"/>
                         </m:rPr>
-                        <m:t>,</m:t>
+                        <m:t>+</m:t>
                       </m:r>
                       <m:r>
-                        <m:t>i</m:t>
+                        <m:t>4</m:t>
                       </m:r>
-                    </m:sub>
-                  </m:sSub>
-                </m:e>
-              </m:d>
-              <m:r>
-                <m:rPr>
-                  <m:sty m:val="p"/>
-                </m:rPr>
-                <m:t>,</m:t>
-              </m:r>
-              <m:r>
-                <m:t> </m:t>
-              </m:r>
-              <m:r>
-                <m:t>γ</m:t>
-              </m:r>
-              <m:r>
-                <m:rPr>
-                  <m:sty m:val="p"/>
-                </m:rPr>
-                <m:t>=</m:t>
-              </m:r>
-              <m:r>
-                <m:rPr>
-                  <m:sty m:val="p"/>
-                </m:rPr>
-                <m:t>[</m:t>
-              </m:r>
-              <m:r>
-                <m:t>z</m:t>
-              </m:r>
-              <m:rad>
-                <m:radPr>
-                  <m:degHide m:val="on"/>
-                </m:radPr>
-                <m:deg/>
-                <m:e>
-                  <m:r>
-                    <m:t>2</m:t>
-                  </m:r>
-                  <m:r>
-                    <m:rPr>
-                      <m:sty m:val="p"/>
-                    </m:rPr>
-                    <m:t>+</m:t>
-                  </m:r>
-                  <m:r>
-                    <m:t>4</m:t>
-                  </m:r>
-                  <m:acc>
-                    <m:accPr>
-                      <m:chr m:val="‾"/>
-                    </m:accPr>
+                      <m:acc>
+                        <m:accPr>
+                          <m:chr m:val="‾"/>
+                        </m:accPr>
+                        <m:e>
+                          <m:r>
+                            <m:t>p</m:t>
+                          </m:r>
+                        </m:e>
+                      </m:acc>
+                      <m:r>
+                        <m:rPr>
+                          <m:sty m:val="p"/>
+                        </m:rPr>
+                        <m:t>(</m:t>
+                      </m:r>
+                      <m:r>
+                        <m:t>1</m:t>
+                      </m:r>
+                      <m:r>
+                        <m:rPr>
+                          <m:sty m:val="p"/>
+                        </m:rPr>
+                        <m:t>−</m:t>
+                      </m:r>
+                      <m:acc>
+                        <m:accPr>
+                          <m:chr m:val="‾"/>
+                        </m:accPr>
+                        <m:e>
+                          <m:r>
+                            <m:t>p</m:t>
+                          </m:r>
+                        </m:e>
+                      </m:acc>
+                      <m:r>
+                        <m:rPr>
+                          <m:sty m:val="p"/>
+                        </m:rPr>
+                        <m:t>)</m:t>
+                      </m:r>
+                      <m:sSup>
+                        <m:e>
+                          <m:r>
+                            <m:t>z</m:t>
+                          </m:r>
+                        </m:e>
+                        <m:sup>
+                          <m:r>
+                            <m:t>2</m:t>
+                          </m:r>
+                        </m:sup>
+                      </m:sSup>
+                    </m:e>
+                  </m:rad>
+                  <m:sSubSup>
                     <m:e>
                       <m:r>
-                        <m:t>p</m:t>
-                      </m:r>
-                    </m:e>
-                  </m:acc>
-                  <m:r>
-                    <m:rPr>
-                      <m:sty m:val="p"/>
-                    </m:rPr>
-                    <m:t>(</m:t>
-                  </m:r>
-                  <m:r>
-                    <m:t>1</m:t>
-                  </m:r>
-                  <m:r>
-                    <m:rPr>
-                      <m:sty m:val="p"/>
-                    </m:rPr>
-                    <m:t>−</m:t>
-                  </m:r>
-                  <m:acc>
-                    <m:accPr>
-                      <m:chr m:val="‾"/>
-                    </m:accPr>
-                    <m:e>
-                      <m:r>
-                        <m:t>p</m:t>
-                      </m:r>
-                    </m:e>
-                  </m:acc>
-                  <m:r>
-                    <m:rPr>
-                      <m:sty m:val="p"/>
-                    </m:rPr>
-                    <m:t>)</m:t>
-                  </m:r>
-                  <m:sSup>
-                    <m:e>
-                      <m:r>
-                        <m:t>z</m:t>
-                      </m:r>
-                    </m:e>
-                    <m:sup>
-                      <m:r>
-                        <m:t>2</m:t>
-                      </m:r>
-                    </m:sup>
-                  </m:sSup>
-                </m:e>
-              </m:rad>
-              <m:sSubSup>
-                <m:e>
-                  <m:r>
-                    <m:rPr>
-                      <m:sty m:val="p"/>
-                    </m:rPr>
-                    <m:t>]</m:t>
-                  </m:r>
-                </m:e>
-                <m:sub>
-                  <m:r>
-                    <m:rPr>
-                      <m:sty m:val="p"/>
-                    </m:rPr>
-                    <m:t>−</m:t>
-                  </m:r>
-                  <m:sSub>
-                    <m:e>
-                      <m:r>
-                        <m:t>γ</m:t>
+                        <m:rPr>
+                          <m:sty m:val="p"/>
+                        </m:rPr>
+                        <m:t>]</m:t>
                       </m:r>
                     </m:e>
                     <m:sub>
@@ -7655,35 +7649,50 @@
                         <m:rPr>
                           <m:sty m:val="p"/>
                         </m:rPr>
-                        <m:t>max</m:t>
+                        <m:t>−</m:t>
                       </m:r>
+                      <m:sSub>
+                        <m:e>
+                          <m:r>
+                            <m:t>γ</m:t>
+                          </m:r>
+                        </m:e>
+                        <m:sub>
+                          <m:r>
+                            <m:rPr>
+                              <m:sty m:val="p"/>
+                            </m:rPr>
+                            <m:t>max</m:t>
+                          </m:r>
+                        </m:sub>
+                      </m:sSub>
                     </m:sub>
-                  </m:sSub>
-                </m:sub>
-                <m:sup>
-                  <m:sSub>
-                    <m:e>
-                      <m:r>
-                        <m:t>γ</m:t>
-                      </m:r>
-                    </m:e>
-                    <m:sub>
-                      <m:r>
-                        <m:rPr>
-                          <m:sty m:val="p"/>
-                        </m:rPr>
-                        <m:t>max</m:t>
-                      </m:r>
-                    </m:sub>
-                  </m:sSub>
-                </m:sup>
-              </m:sSubSup>
-              <m:r>
-                <m:rPr>
-                  <m:sty m:val="p"/>
-                </m:rPr>
-                <m:t>,</m:t>
-              </m:r>
+                    <m:sup>
+                      <m:sSub>
+                        <m:e>
+                          <m:r>
+                            <m:t>γ</m:t>
+                          </m:r>
+                        </m:e>
+                        <m:sub>
+                          <m:r>
+                            <m:rPr>
+                              <m:sty m:val="p"/>
+                            </m:rPr>
+                            <m:t>max</m:t>
+                          </m:r>
+                        </m:sub>
+                      </m:sSub>
+                    </m:sup>
+                  </m:sSubSup>
+                  <m:r>
+                    <m:rPr>
+                      <m:sty m:val="p"/>
+                    </m:rPr>
+                    <m:t>,</m:t>
+                  </m:r>
+                </m:e>
+              </m:eqArr>
               <m:r>
                 <m:t> </m:t>
               </m:r>
@@ -7868,7 +7877,7 @@
             <m:t>,</m:t>
           </m:r>
           <m:r>
-            <m:t>  </m:t>
+            <m:t> </m:t>
           </m:r>
           <m:r>
             <m:t>ζ</m:t>
@@ -7879,34 +7888,37 @@
             </m:rPr>
             <m:t>=</m:t>
           </m:r>
-          <m:acc>
-            <m:accPr>
-              <m:chr m:val="̂"/>
-            </m:accPr>
-            <m:e>
+          <m:f>
+            <m:fPr>
+              <m:type m:val="lin"/>
+            </m:fPr>
+            <m:num>
+              <m:acc>
+                <m:accPr>
+                  <m:chr m:val="̂"/>
+                </m:accPr>
+                <m:e>
+                  <m:r>
+                    <m:t>D</m:t>
+                  </m:r>
+                </m:e>
+              </m:acc>
+            </m:num>
+            <m:den>
               <m:r>
-                <m:t>D</m:t>
+                <m:rPr>
+                  <m:sty m:val="p"/>
+                </m:rPr>
+                <m:t>S</m:t>
               </m:r>
-            </m:e>
-          </m:acc>
-          <m:r>
-            <m:rPr>
-              <m:sty m:val="p"/>
-            </m:rPr>
-            <m:t>/</m:t>
-          </m:r>
-          <m:r>
-            <m:rPr>
-              <m:sty m:val="p"/>
-            </m:rPr>
-            <m:t>S</m:t>
-          </m:r>
-          <m:r>
-            <m:rPr>
-              <m:sty m:val="p"/>
-            </m:rPr>
-            <m:t>E</m:t>
-          </m:r>
+              <m:r>
+                <m:rPr>
+                  <m:sty m:val="p"/>
+                </m:rPr>
+                <m:t>E</m:t>
+              </m:r>
+            </m:den>
+          </m:f>
           <m:r>
             <m:rPr>
               <m:sty m:val="p"/>
@@ -22183,7 +22195,7 @@
         <w:t xml:space="preserve"> </w:t>
       </w:r>
       <w:r>
-        <w:t xml:space="preserve">the fraction that are decisive</w:t>
+        <w:t xml:space="preserve">(Win.) the fraction that are decisive</w:t>
       </w:r>
       <w:r>
         <w:t xml:space="preserve"> </w:t>
@@ -22199,13 +22211,13 @@
         <w:t xml:space="preserve"> </w:t>
       </w:r>
       <w:r>
-        <w:t xml:space="preserve">have the correct</w:t>
-      </w:r>
-      <w:r>
-        <w:t xml:space="preserve"> </w:t>
-      </w:r>
-      <w:r>
-        <w:t xml:space="preserve">answer somewhere in the pool. The window is the ceiling for any label-free</w:t>
+        <w:t xml:space="preserve">have the</w:t>
+      </w:r>
+      <w:r>
+        <w:t xml:space="preserve"> </w:t>
+      </w:r>
+      <w:r>
+        <w:t xml:space="preserve">correct answer somewhere in the pool; both in per cent. The window is the ceiling for any label-free</w:t>
       </w:r>
       <w:r>
         <w:t xml:space="preserve"> </w:t>
@@ -22254,7 +22266,7 @@
         <w:tblStyle w:val="Table"/>
         <w:tblW w:type="auto" w:w="0"/>
         <w:tblLook w:firstRow="1" w:lastRow="0" w:firstColumn="0" w:lastColumn="0" w:noHBand="0" w:noVBand="0" w:val="0020"/>
-        <w:tblCaption w:val="The addressable stratum across substrates, on one definition throughout: decisive is the fraction of items whose plurality is wrong, window the fraction that are decisive and have the correct answer somewhere in the pool. The window is the ceiling for any label-free aggregation method. Rows marked \dagger are measured here; HumanEval+/MBPP+ is recomputed from published oracle-minus-selector tables, which report the window only. As items harden the decisive fraction grows but the window does not: they pass from saturated to capability-limited."/>
+        <w:tblCaption w:val="The addressable stratum across substrates, on one definition throughout: decisive is the fraction of items whose plurality is wrong, window (Win.) the fraction that are decisive and have the correct answer somewhere in the pool; both in per cent. The window is the ceiling for any label-free aggregation method. Rows marked \dagger are measured here; HumanEval+/MBPP+ is recomputed from published oracle-minus-selector tables, which report the window only. As items harden the decisive fraction grows but the window does not: they pass from saturated to capability-limited."/>
       </w:tblPr>
       <w:tblGrid>
         <w:gridCol w:w="1980"/>
@@ -22295,10 +22307,10 @@
           <w:p>
             <w:pPr>
               <w:pStyle w:val="Compact"/>
-              <w:jc w:val="center"/>
+              <w:jc w:val="right"/>
             </w:pPr>
             <w:r>
-              <w:t xml:space="preserve">Decisive</w:t>
+              <w:t xml:space="preserve">Dec.</w:t>
             </w:r>
           </w:p>
         </w:tc>
@@ -22307,10 +22319,10 @@
           <w:p>
             <w:pPr>
               <w:pStyle w:val="Compact"/>
-              <w:jc w:val="center"/>
+              <w:jc w:val="right"/>
             </w:pPr>
             <w:r>
-              <w:t xml:space="preserve">Window</w:t>
+              <w:t xml:space="preserve">Win.</w:t>
             </w:r>
           </w:p>
         </w:tc>
@@ -22336,7 +22348,7 @@
               <w:jc w:val="left"/>
             </w:pPr>
             <w:r>
-              <w:t xml:space="preserve">GSM8K / CommonsenseQA</w:t>
+              <w:t xml:space="preserve">GSM8K / CSQA</w:t>
             </w:r>
             <m:oMath>
               <m:sSup>
@@ -22362,17 +22374,11 @@
           <w:p>
             <w:pPr>
               <w:pStyle w:val="Compact"/>
-              <w:jc w:val="center"/>
+              <w:jc w:val="right"/>
             </w:pPr>
             <m:oMath>
               <m:r>
                 <m:t>9.0</m:t>
-              </m:r>
-              <m:r>
-                <m:rPr>
-                  <m:sty m:val="p"/>
-                </m:rPr>
-                <m:t>%</m:t>
               </m:r>
             </m:oMath>
           </w:p>
@@ -22382,17 +22388,11 @@
           <w:p>
             <w:pPr>
               <w:pStyle w:val="Compact"/>
-              <w:jc w:val="center"/>
+              <w:jc w:val="right"/>
             </w:pPr>
             <m:oMath>
               <m:r>
                 <m:t>4.0</m:t>
-              </m:r>
-              <m:r>
-                <m:rPr>
-                  <m:sty m:val="p"/>
-                </m:rPr>
-                <m:t>%</m:t>
               </m:r>
             </m:oMath>
           </w:p>
@@ -22419,7 +22419,7 @@
               <w:jc w:val="left"/>
             </w:pPr>
             <w:r>
-              <w:t xml:space="preserve">MATH level-5</w:t>
+              <w:t xml:space="preserve">MATH L5</w:t>
             </w:r>
             <m:oMath>
               <m:sSup>
@@ -22445,17 +22445,11 @@
           <w:p>
             <w:pPr>
               <w:pStyle w:val="Compact"/>
-              <w:jc w:val="center"/>
+              <w:jc w:val="right"/>
             </w:pPr>
             <m:oMath>
               <m:r>
                 <m:t>7.6</m:t>
-              </m:r>
-              <m:r>
-                <m:rPr>
-                  <m:sty m:val="p"/>
-                </m:rPr>
-                <m:t>%</m:t>
               </m:r>
             </m:oMath>
           </w:p>
@@ -22465,17 +22459,11 @@
           <w:p>
             <w:pPr>
               <w:pStyle w:val="Compact"/>
-              <w:jc w:val="center"/>
+              <w:jc w:val="right"/>
             </w:pPr>
             <m:oMath>
               <m:r>
                 <m:t>2.5</m:t>
-              </m:r>
-              <m:r>
-                <m:rPr>
-                  <m:sty m:val="p"/>
-                </m:rPr>
-                <m:t>%</m:t>
               </m:r>
             </m:oMath>
           </w:p>
@@ -22528,17 +22516,11 @@
           <w:p>
             <w:pPr>
               <w:pStyle w:val="Compact"/>
-              <w:jc w:val="center"/>
+              <w:jc w:val="right"/>
             </w:pPr>
             <m:oMath>
               <m:r>
                 <m:t>23.3</m:t>
-              </m:r>
-              <m:r>
-                <m:rPr>
-                  <m:sty m:val="p"/>
-                </m:rPr>
-                <m:t>%</m:t>
               </m:r>
             </m:oMath>
           </w:p>
@@ -22548,17 +22530,11 @@
           <w:p>
             <w:pPr>
               <w:pStyle w:val="Compact"/>
-              <w:jc w:val="center"/>
+              <w:jc w:val="right"/>
             </w:pPr>
             <m:oMath>
               <m:r>
                 <m:t>3.3</m:t>
-              </m:r>
-              <m:r>
-                <m:rPr>
-                  <m:sty m:val="p"/>
-                </m:rPr>
-                <m:t>%</m:t>
               </m:r>
             </m:oMath>
           </w:p>
@@ -22594,7 +22570,7 @@
           <w:p>
             <w:pPr>
               <w:pStyle w:val="Compact"/>
-              <w:jc w:val="center"/>
+              <w:jc w:val="right"/>
             </w:pPr>
             <w:r>
               <w:t xml:space="preserve">—</w:t>
@@ -22606,17 +22582,11 @@
           <w:p>
             <w:pPr>
               <w:pStyle w:val="Compact"/>
-              <w:jc w:val="center"/>
+              <w:jc w:val="right"/>
             </w:pPr>
             <m:oMath>
               <m:r>
                 <m:t>3.6</m:t>
-              </m:r>
-              <m:r>
-                <m:rPr>
-                  <m:sty m:val="p"/>
-                </m:rPr>
-                <m:t>%</m:t>
               </m:r>
             </m:oMath>
           </w:p>
@@ -22669,17 +22639,11 @@
           <w:p>
             <w:pPr>
               <w:pStyle w:val="Compact"/>
-              <w:jc w:val="center"/>
+              <w:jc w:val="right"/>
             </w:pPr>
             <m:oMath>
               <m:r>
                 <m:t>25.0</m:t>
-              </m:r>
-              <m:r>
-                <m:rPr>
-                  <m:sty m:val="p"/>
-                </m:rPr>
-                <m:t>%</m:t>
               </m:r>
             </m:oMath>
           </w:p>
@@ -22689,17 +22653,11 @@
           <w:p>
             <w:pPr>
               <w:pStyle w:val="Compact"/>
-              <w:jc w:val="center"/>
+              <w:jc w:val="right"/>
             </w:pPr>
             <m:oMath>
               <m:r>
                 <m:t>7.5</m:t>
-              </m:r>
-              <m:r>
-                <m:rPr>
-                  <m:sty m:val="p"/>
-                </m:rPr>
-                <m:t>%</m:t>
               </m:r>
             </m:oMath>
           </w:p>
@@ -22714,7 +22672,7 @@
               <w:jc w:val="left"/>
             </w:pPr>
             <w:r>
-              <w:t xml:space="preserve">QA, budget-constrained</w:t>
+              <w:t xml:space="preserve">QA, budget-capped</w:t>
             </w:r>
           </w:p>
         </w:tc>
@@ -22726,7 +22684,7 @@
               <w:jc w:val="left"/>
             </w:pPr>
             <w:r>
-              <w:t xml:space="preserve">MATH level-5</w:t>
+              <w:t xml:space="preserve">MATH L5</w:t>
             </w:r>
             <m:oMath>
               <m:sSup>
@@ -22752,17 +22710,11 @@
           <w:p>
             <w:pPr>
               <w:pStyle w:val="Compact"/>
-              <w:jc w:val="center"/>
+              <w:jc w:val="right"/>
             </w:pPr>
             <m:oMath>
               <m:r>
                 <m:t>18.5</m:t>
-              </m:r>
-              <m:r>
-                <m:rPr>
-                  <m:sty m:val="p"/>
-                </m:rPr>
-                <m:t>%</m:t>
               </m:r>
             </m:oMath>
           </w:p>
@@ -22772,17 +22724,11 @@
           <w:p>
             <w:pPr>
               <w:pStyle w:val="Compact"/>
-              <w:jc w:val="center"/>
+              <w:jc w:val="right"/>
             </w:pPr>
             <m:oMath>
               <m:r>
                 <m:t>11.8</m:t>
-              </m:r>
-              <m:r>
-                <m:rPr>
-                  <m:sty m:val="p"/>
-                </m:rPr>
-                <m:t>%</m:t>
               </m:r>
             </m:oMath>
           </w:p>

</xml_diff>